<commit_message>
vault backup: 2026-06-24 15:48:11
</commit_message>
<xml_diff>
--- a/工作笔记/ZYDB/02_信息化建设/五年计划/五年规划调整建议_公文版.docx
+++ b/工作笔记/ZYDB/02_信息化建设/五年计划/五年规划调整建议_公文版.docx
@@ -28,17 +28,275 @@
     </w:p>
     <w:p>
       <w:pPr>
+        <w:pStyle w:val="4"/>
+        <w:spacing w:before="0" w:after="720" w:line="560" w:lineRule="exact"/>
+        <w:ind w:left="0" w:firstLine="0" w:firstLineChars="0"/>
+        <w:jc w:val="left"/>
+        <w:rPr>
+          <w:rFonts w:hint="eastAsia" w:ascii="黑体" w:hAnsi="黑体" w:eastAsia="黑体" w:cs="黑体"/>
+          <w:b w:val="0"/>
+          <w:color w:val="000000"/>
+          <w:sz w:val="32"/>
+        </w:rPr>
+      </w:pPr>
+      <w:bookmarkStart w:id="1" w:name="一建议明确平台的建设原则自主可控建设外包"/>
+      <w:r>
+        <w:rPr>
+          <w:rFonts w:hint="eastAsia" w:ascii="黑体" w:hAnsi="黑体" w:eastAsia="黑体" w:cs="黑体"/>
+          <w:b w:val="0"/>
+          <w:color w:val="000000"/>
+          <w:sz w:val="32"/>
+        </w:rPr>
+        <w:t>一、　建议明确平台的建设原则：自主可控，建设外包</w:t>
+      </w:r>
+    </w:p>
+    <w:p>
+      <w:pPr>
         <w:pStyle w:val="23"/>
         <w:spacing w:before="0" w:after="0" w:line="560" w:lineRule="exact"/>
         <w:ind w:left="0" w:firstLine="640" w:firstLineChars="200"/>
         <w:jc w:val="both"/>
         <w:rPr>
+          <w:rFonts w:hint="eastAsia" w:ascii="仿宋" w:hAnsi="仿宋" w:eastAsia="仿宋" w:cs="仿宋"/>
+          <w:b w:val="0"/>
+          <w:color w:val="000000"/>
+          <w:sz w:val="32"/>
+        </w:rPr>
+      </w:pPr>
+      <w:r>
+        <w:rPr>
+          <w:rFonts w:hint="eastAsia" w:ascii="仿宋" w:hAnsi="仿宋" w:eastAsia="仿宋" w:cs="仿宋"/>
+          <w:b w:val="0"/>
+          <w:color w:val="000000"/>
+          <w:sz w:val="32"/>
+        </w:rPr>
+        <w:t>平台建设遵循”自主可控、建设外包”的策略，在主导权和建设模式两个层面明确分工与边界，既保障公司的战略主导权，又借助外部专业力量快速实现落地。</w:t>
+      </w:r>
+    </w:p>
+    <w:p>
+      <w:pPr>
+        <w:pStyle w:val="5"/>
+        <w:spacing w:before="0" w:after="0" w:line="560" w:lineRule="exact"/>
+        <w:ind w:left="0" w:firstLine="643" w:firstLineChars="200"/>
+        <w:jc w:val="both"/>
+        <w:rPr>
+          <w:rFonts w:hint="eastAsia" w:ascii="楷体" w:hAnsi="楷体" w:eastAsia="楷体" w:cs="楷体"/>
+          <w:b/>
+          <w:color w:val="000000"/>
+          <w:sz w:val="32"/>
+        </w:rPr>
+      </w:pPr>
+      <w:bookmarkStart w:id="2" w:name="二必要性与合理性"/>
+      <w:r>
+        <w:rPr>
+          <w:rFonts w:hint="eastAsia" w:ascii="楷体" w:hAnsi="楷体" w:eastAsia="楷体" w:cs="楷体"/>
+          <w:b/>
+          <w:color w:val="000000"/>
+          <w:sz w:val="32"/>
+        </w:rPr>
+        <w:t>（二）必要性与合理性</w:t>
+      </w:r>
+    </w:p>
+    <w:p>
+      <w:pPr>
+        <w:pStyle w:val="23"/>
+        <w:spacing w:before="0" w:after="0" w:line="560" w:lineRule="exact"/>
+        <w:ind w:left="0" w:firstLine="640" w:firstLineChars="200"/>
+        <w:jc w:val="both"/>
+        <w:rPr>
+          <w:rFonts w:hint="eastAsia" w:ascii="仿宋" w:hAnsi="仿宋" w:eastAsia="仿宋" w:cs="仿宋"/>
+          <w:b w:val="0"/>
+          <w:color w:val="000000"/>
+          <w:sz w:val="32"/>
+        </w:rPr>
+      </w:pPr>
+      <w:r>
+        <w:rPr>
+          <w:rFonts w:hint="eastAsia" w:ascii="仿宋" w:hAnsi="仿宋" w:eastAsia="仿宋" w:cs="仿宋"/>
+          <w:b w:val="0"/>
+          <w:color w:val="000000"/>
+          <w:sz w:val="32"/>
+        </w:rPr>
+        <w:t>①为什么必须”自主可控”</w:t>
+      </w:r>
+    </w:p>
+    <w:p>
+      <w:pPr>
+        <w:pStyle w:val="3"/>
+        <w:spacing w:before="0" w:after="0" w:line="560" w:lineRule="exact"/>
+        <w:ind w:left="0" w:firstLine="640" w:firstLineChars="200"/>
+        <w:jc w:val="both"/>
+        <w:rPr>
+          <w:rFonts w:hint="eastAsia" w:ascii="仿宋" w:hAnsi="仿宋" w:eastAsia="仿宋" w:cs="仿宋"/>
+          <w:b w:val="0"/>
+          <w:color w:val="000000"/>
+          <w:sz w:val="32"/>
+        </w:rPr>
+      </w:pPr>
+      <w:r>
+        <w:rPr>
+          <w:rFonts w:hint="eastAsia" w:ascii="仿宋" w:hAnsi="仿宋" w:eastAsia="仿宋" w:cs="仿宋"/>
+          <w:b w:val="0"/>
+          <w:color w:val="000000"/>
+          <w:sz w:val="32"/>
+        </w:rPr>
+        <w:t>手拉手及全城联卖平台是公司”两翼”战略的核心组成部分，是公司未来获取流量、沉淀数据、拓展业务场景的战略性基础设施。平台一旦建成，将承载公司核心业务数据（房源信息、交易数据、客户资料、资金流水等），直接关系到公司的业务安全与长期竞争力。如果平台的设计权、标准制定权、数据主权不在自己手中，未来每一次功能调整、每一次供应商更换、每一次战略转型，都可能受制于人——轻则成本高昂，重则战略被动。因此，平台的主导权必须掌握在公司自己手里，不能外包，也不能让渡。</w:t>
+      </w:r>
+    </w:p>
+    <w:p>
+      <w:pPr>
+        <w:pStyle w:val="3"/>
+        <w:spacing w:before="0" w:after="0" w:line="560" w:lineRule="exact"/>
+        <w:ind w:left="0" w:firstLine="640" w:firstLineChars="200"/>
+        <w:jc w:val="both"/>
+        <w:rPr>
+          <w:rFonts w:hint="eastAsia" w:ascii="仿宋" w:hAnsi="仿宋" w:eastAsia="仿宋" w:cs="仿宋"/>
+          <w:b w:val="0"/>
+          <w:color w:val="000000"/>
+          <w:sz w:val="32"/>
+        </w:rPr>
+      </w:pPr>
+      <w:r>
+        <w:rPr>
+          <w:rFonts w:hint="eastAsia" w:ascii="仿宋" w:hAnsi="仿宋" w:eastAsia="仿宋" w:cs="仿宋"/>
+          <w:b w:val="0"/>
+          <w:color w:val="000000"/>
+          <w:sz w:val="32"/>
+        </w:rPr>
+        <w:t>②为什么必须”建设外包”</w:t>
+      </w:r>
+    </w:p>
+    <w:p>
+      <w:pPr>
+        <w:pStyle w:val="3"/>
+        <w:spacing w:before="0" w:after="0" w:line="560" w:lineRule="exact"/>
+        <w:ind w:left="0" w:firstLine="640" w:firstLineChars="200"/>
+        <w:jc w:val="both"/>
+        <w:rPr>
+          <w:rFonts w:hint="eastAsia" w:ascii="仿宋" w:hAnsi="仿宋" w:eastAsia="仿宋" w:cs="仿宋"/>
+          <w:b w:val="0"/>
+          <w:color w:val="000000"/>
+          <w:sz w:val="32"/>
+        </w:rPr>
+      </w:pPr>
+      <w:r>
+        <w:rPr>
+          <w:rFonts w:hint="eastAsia" w:ascii="仿宋" w:hAnsi="仿宋" w:eastAsia="仿宋" w:cs="仿宋"/>
+          <w:b w:val="0"/>
+          <w:color w:val="000000"/>
+          <w:sz w:val="32"/>
+        </w:rPr>
+        <w:t>公司IT团队当前的人力规模和技术储备，尚不足以支撑从零开始自研一套完整的房产交易平台。如果坚持完全自研，开发周期可能在三年以上，不仅延误战略窗口期，而且从零自研的技术风险和质量风险也远高于采购成熟产品。通过采购成熟的源码平台作为底座，并借助外包实施力量快速完成定制开发，可以用合理的成本换取1—2年的时间优势，让平台尽快上线验证业务模式，抢占市场先机。</w:t>
+      </w:r>
+    </w:p>
+    <w:p>
+      <w:pPr>
+        <w:pStyle w:val="3"/>
+        <w:spacing w:before="0" w:after="0" w:line="560" w:lineRule="exact"/>
+        <w:ind w:left="0" w:firstLine="640" w:firstLineChars="200"/>
+        <w:jc w:val="both"/>
+        <w:rPr>
+          <w:rFonts w:hint="eastAsia" w:ascii="仿宋" w:hAnsi="仿宋" w:eastAsia="仿宋" w:cs="仿宋"/>
+          <w:b w:val="0"/>
+          <w:color w:val="000000"/>
+          <w:sz w:val="32"/>
+        </w:rPr>
+      </w:pPr>
+      <w:r>
+        <w:rPr>
+          <w:rFonts w:hint="eastAsia" w:ascii="仿宋" w:hAnsi="仿宋" w:eastAsia="仿宋" w:cs="仿宋"/>
+          <w:b w:val="0"/>
+          <w:color w:val="000000"/>
+          <w:sz w:val="32"/>
+        </w:rPr>
+        <w:t>③两者结合为什么是当前最优解</w:t>
+      </w:r>
+    </w:p>
+    <w:p>
+      <w:pPr>
+        <w:pStyle w:val="3"/>
+        <w:spacing w:before="0" w:after="0" w:line="560" w:lineRule="exact"/>
+        <w:ind w:left="0" w:firstLine="640" w:firstLineChars="200"/>
+        <w:jc w:val="both"/>
+        <w:rPr>
+          <w:rFonts w:hint="eastAsia" w:ascii="仿宋" w:hAnsi="仿宋" w:eastAsia="仿宋" w:cs="仿宋"/>
+          <w:b w:val="0"/>
+          <w:color w:val="000000"/>
+          <w:sz w:val="32"/>
+        </w:rPr>
+      </w:pPr>
+      <w:r>
+        <w:rPr>
+          <w:rFonts w:hint="eastAsia" w:ascii="仿宋" w:hAnsi="仿宋" w:eastAsia="仿宋" w:cs="仿宋"/>
+          <w:b w:val="0"/>
+          <w:color w:val="000000"/>
+          <w:sz w:val="32"/>
+        </w:rPr>
+        <w:t>“自主可控”与”建设外包”并非矛盾，而是分工不同、互为支撑。公司自主做好顶层设计，明确”要什么、建成什么样”，外包负责”怎么建、用什么技术建”——这种模式下，公司不用担心被供应商”绑架”，因为蓝图是自己画的、标准是自己定的，外包只是按图施工的”施工队”；同时，公司也不用因为力量不足而无限期拖延，因为落地实施由专业的外包力量来完成。</w:t>
+      </w:r>
+    </w:p>
+    <w:p>
+      <w:pPr>
+        <w:pStyle w:val="3"/>
+        <w:spacing w:before="0" w:after="0" w:line="560" w:lineRule="exact"/>
+        <w:ind w:left="0" w:firstLine="640" w:firstLineChars="200"/>
+        <w:jc w:val="both"/>
+        <w:rPr>
+          <w:rFonts w:hint="eastAsia" w:ascii="仿宋" w:hAnsi="仿宋" w:eastAsia="仿宋" w:cs="仿宋"/>
+          <w:b w:val="0"/>
+          <w:color w:val="000000"/>
+          <w:sz w:val="32"/>
+        </w:rPr>
+      </w:pPr>
+      <w:r>
+        <w:rPr>
+          <w:rFonts w:hint="eastAsia" w:ascii="仿宋" w:hAnsi="仿宋" w:eastAsia="仿宋" w:cs="仿宋"/>
+          <w:b w:val="0"/>
+          <w:color w:val="000000"/>
+          <w:sz w:val="32"/>
+        </w:rPr>
+        <w:t>④长期价值</w:t>
+      </w:r>
+    </w:p>
+    <w:p>
+      <w:pPr>
+        <w:pStyle w:val="3"/>
+        <w:spacing w:before="0" w:after="0" w:line="560" w:lineRule="exact"/>
+        <w:ind w:left="0" w:firstLine="640" w:firstLineChars="200"/>
+        <w:jc w:val="both"/>
+        <w:rPr>
+          <w:rFonts w:hint="eastAsia" w:ascii="仿宋" w:hAnsi="仿宋" w:eastAsia="仿宋" w:cs="仿宋"/>
+          <w:b w:val="0"/>
+          <w:color w:val="000000"/>
+          <w:sz w:val="32"/>
+        </w:rPr>
+      </w:pPr>
+      <w:r>
+        <w:rPr>
+          <w:rFonts w:hint="eastAsia" w:ascii="仿宋" w:hAnsi="仿宋" w:eastAsia="仿宋" w:cs="仿宋"/>
+          <w:b w:val="0"/>
+          <w:color w:val="000000"/>
+          <w:sz w:val="32"/>
+        </w:rPr>
+        <w:t>通过”自主可控、建设外包”的策略，公司可以在1—2年内快速拿到可用的平台，在业务跑通的同时，内部团队通过全程跟学跟建逐步建立自主维护能力，最终实现”外包实施→内部维护”的平滑过渡。这是一个”既能快速拿到结果、又能持续积累能力”的最优路径。</w:t>
+      </w:r>
+    </w:p>
+    <w:bookmarkEnd w:id="1"/>
+    <w:bookmarkEnd w:id="2"/>
+    <w:p>
+      <w:pPr>
+        <w:pStyle w:val="4"/>
+        <w:spacing w:before="0" w:after="720" w:line="560" w:lineRule="exact"/>
+        <w:ind w:left="0" w:firstLine="0" w:firstLineChars="0"/>
+        <w:jc w:val="left"/>
+        <w:rPr>
           <w:rFonts w:hint="eastAsia" w:ascii="黑体" w:hAnsi="黑体" w:eastAsia="黑体" w:cs="黑体"/>
           <w:b w:val="0"/>
           <w:color w:val="000000"/>
           <w:sz w:val="32"/>
         </w:rPr>
       </w:pPr>
+      <w:bookmarkStart w:id="3" w:name="二关于平台策略由c端先行调整为b端先行"/>
       <w:r>
         <w:rPr>
           <w:rFonts w:hint="eastAsia" w:ascii="黑体" w:hAnsi="黑体" w:eastAsia="黑体" w:cs="黑体"/>
@@ -46,965 +304,31 @@
           <w:color w:val="000000"/>
           <w:sz w:val="32"/>
         </w:rPr>
-        <w:t>一、建议明确平台的建设原则：自主可控，建设外包</w:t>
-      </w:r>
-    </w:p>
-    <w:p>
-      <w:pPr>
-        <w:pStyle w:val="3"/>
-        <w:spacing w:before="0" w:after="0" w:line="560" w:lineRule="exact"/>
-        <w:ind w:left="0" w:firstLine="640" w:firstLineChars="200"/>
-        <w:jc w:val="both"/>
-        <w:rPr>
-          <w:rFonts w:hint="eastAsia" w:ascii="仿宋" w:hAnsi="仿宋" w:eastAsia="仿宋" w:cs="仿宋"/>
-          <w:b w:val="0"/>
-          <w:color w:val="000000"/>
-          <w:sz w:val="32"/>
-        </w:rPr>
-      </w:pPr>
-      <w:r>
-        <w:rPr>
-          <w:rFonts w:hint="eastAsia" w:ascii="仿宋" w:hAnsi="仿宋" w:eastAsia="仿宋" w:cs="仿宋"/>
-          <w:b w:val="0"/>
-          <w:color w:val="000000"/>
-          <w:sz w:val="32"/>
-        </w:rPr>
-        <w:t>平台建设遵循”自主可控、建设外包”的策略，在主导权和建设模式两个层面明确分工与边界，既保障公司的战略主导权，又借助外部专业力量快速实现落地。</w:t>
-      </w:r>
-    </w:p>
-    <w:p>
-      <w:pPr>
-        <w:pStyle w:val="3"/>
-        <w:spacing w:before="0" w:after="0" w:line="560" w:lineRule="exact"/>
-        <w:ind w:left="0" w:firstLine="640" w:firstLineChars="200"/>
-        <w:jc w:val="both"/>
-        <w:rPr>
-          <w:rFonts w:hint="eastAsia" w:ascii="仿宋" w:hAnsi="仿宋" w:eastAsia="仿宋" w:cs="仿宋"/>
-          <w:b w:val="0"/>
-          <w:color w:val="000000"/>
-          <w:sz w:val="32"/>
-        </w:rPr>
-      </w:pPr>
-      <w:r>
-        <w:rPr>
-          <w:rFonts w:hint="eastAsia" w:ascii="仿宋" w:hAnsi="仿宋" w:eastAsia="仿宋" w:cs="仿宋"/>
-          <w:b w:val="0"/>
-          <w:color w:val="000000"/>
-          <w:sz w:val="32"/>
-        </w:rPr>
-        <w:t>（二）必要性与合理性</w:t>
-      </w:r>
-    </w:p>
-    <w:p>
-      <w:pPr>
-        <w:pStyle w:val="3"/>
-        <w:spacing w:before="0" w:after="0" w:line="560" w:lineRule="exact"/>
-        <w:ind w:left="0" w:firstLine="640" w:firstLineChars="200"/>
-        <w:jc w:val="both"/>
-        <w:rPr>
-          <w:rFonts w:hint="eastAsia" w:ascii="仿宋" w:hAnsi="仿宋" w:eastAsia="仿宋" w:cs="仿宋"/>
-          <w:b w:val="0"/>
-          <w:color w:val="000000"/>
-          <w:sz w:val="32"/>
-        </w:rPr>
-      </w:pPr>
-      <w:r>
-        <w:rPr>
-          <w:rFonts w:hint="eastAsia" w:ascii="仿宋" w:hAnsi="仿宋" w:eastAsia="仿宋" w:cs="仿宋"/>
-          <w:b w:val="0"/>
-          <w:color w:val="000000"/>
-          <w:sz w:val="32"/>
-        </w:rPr>
-        <w:t>①为什么必须”自主可控”</w:t>
-      </w:r>
-    </w:p>
-    <w:p>
-      <w:pPr>
-        <w:pStyle w:val="3"/>
-        <w:spacing w:before="0" w:after="0" w:line="560" w:lineRule="exact"/>
-        <w:ind w:left="0" w:firstLine="640" w:firstLineChars="200"/>
-        <w:jc w:val="both"/>
-        <w:rPr>
-          <w:rFonts w:hint="eastAsia" w:ascii="仿宋" w:hAnsi="仿宋" w:eastAsia="仿宋" w:cs="仿宋"/>
-          <w:b w:val="0"/>
-          <w:color w:val="000000"/>
-          <w:sz w:val="32"/>
-        </w:rPr>
-      </w:pPr>
-      <w:r>
-        <w:rPr>
-          <w:rFonts w:hint="eastAsia" w:ascii="仿宋" w:hAnsi="仿宋" w:eastAsia="仿宋" w:cs="仿宋"/>
-          <w:b w:val="0"/>
-          <w:color w:val="000000"/>
-          <w:sz w:val="32"/>
-        </w:rPr>
-        <w:t>手拉手及全城联卖平台是公司”两翼”战略的核心组成部分，是公司未来获取流量、沉淀数据、拓展业务场景的战略性基础设施。平台一旦建成，将承载公司核心业务数据（房源信息、交易数据、客户资料、资金流水等），直接关系到公司的业务安全与长期竞争力。如果平台的设计权、标准制定权、数据主权不在自己手中，未来每一次功能调整、每一次供应商更换、每一次战略转型，都可能受制于人——轻则成本高昂，重则战略被动。因此，平台的主导权必须掌握在公司自己手里，不能外包，也不能让渡。</w:t>
-      </w:r>
-    </w:p>
-    <w:p>
-      <w:pPr>
-        <w:pStyle w:val="3"/>
-        <w:spacing w:before="0" w:after="0" w:line="560" w:lineRule="exact"/>
-        <w:ind w:left="0" w:firstLine="640" w:firstLineChars="200"/>
-        <w:jc w:val="both"/>
-        <w:rPr>
-          <w:rFonts w:hint="eastAsia" w:ascii="仿宋" w:hAnsi="仿宋" w:eastAsia="仿宋" w:cs="仿宋"/>
-          <w:b w:val="0"/>
-          <w:color w:val="000000"/>
-          <w:sz w:val="32"/>
-        </w:rPr>
-      </w:pPr>
-      <w:r>
-        <w:rPr>
-          <w:rFonts w:hint="eastAsia" w:ascii="仿宋" w:hAnsi="仿宋" w:eastAsia="仿宋" w:cs="仿宋"/>
-          <w:b w:val="0"/>
-          <w:color w:val="000000"/>
-          <w:sz w:val="32"/>
-        </w:rPr>
-        <w:t>②为什么必须”建设外包”</w:t>
-      </w:r>
-    </w:p>
-    <w:p>
-      <w:pPr>
-        <w:pStyle w:val="3"/>
-        <w:spacing w:before="0" w:after="0" w:line="560" w:lineRule="exact"/>
-        <w:ind w:left="0" w:firstLine="640" w:firstLineChars="200"/>
-        <w:jc w:val="both"/>
-        <w:rPr>
-          <w:rFonts w:hint="eastAsia" w:ascii="仿宋" w:hAnsi="仿宋" w:eastAsia="仿宋" w:cs="仿宋"/>
-          <w:b w:val="0"/>
-          <w:color w:val="000000"/>
-          <w:sz w:val="32"/>
-        </w:rPr>
-      </w:pPr>
-      <w:r>
-        <w:rPr>
-          <w:rFonts w:hint="eastAsia" w:ascii="仿宋" w:hAnsi="仿宋" w:eastAsia="仿宋" w:cs="仿宋"/>
-          <w:b w:val="0"/>
-          <w:color w:val="000000"/>
-          <w:sz w:val="32"/>
-        </w:rPr>
-        <w:t>公司IT团队当前的人力规模和技术储备，尚不足以支撑从零开始自研一套完整的房产交易平台。如果坚持完全自研，开发周期可能在三年以上，不仅延误战略窗口期，而且从零自研的技术风险和质量风险也远高于采购成熟产品。通过采购成熟的源码平台作为底座，并借助外包实施力量快速完成定制开发，可以用合理的成本换取1—2年的时间优势，让平台尽快上线验证业务模式，抢占市场先机。</w:t>
-      </w:r>
-    </w:p>
-    <w:p>
-      <w:pPr>
-        <w:pStyle w:val="3"/>
-        <w:spacing w:before="0" w:after="0" w:line="560" w:lineRule="exact"/>
-        <w:ind w:left="0" w:firstLine="640" w:firstLineChars="200"/>
-        <w:jc w:val="both"/>
-        <w:rPr>
-          <w:rFonts w:hint="eastAsia" w:ascii="仿宋" w:hAnsi="仿宋" w:eastAsia="仿宋" w:cs="仿宋"/>
-          <w:b w:val="0"/>
-          <w:color w:val="000000"/>
-          <w:sz w:val="32"/>
-        </w:rPr>
-      </w:pPr>
-      <w:r>
-        <w:rPr>
-          <w:rFonts w:hint="eastAsia" w:ascii="仿宋" w:hAnsi="仿宋" w:eastAsia="仿宋" w:cs="仿宋"/>
-          <w:b w:val="0"/>
-          <w:color w:val="000000"/>
-          <w:sz w:val="32"/>
-        </w:rPr>
-        <w:t>③两者结合为什么是当前最优解</w:t>
-      </w:r>
-    </w:p>
-    <w:p>
-      <w:pPr>
-        <w:pStyle w:val="3"/>
-        <w:spacing w:before="0" w:after="0" w:line="560" w:lineRule="exact"/>
-        <w:ind w:left="0" w:firstLine="640" w:firstLineChars="200"/>
-        <w:jc w:val="both"/>
-        <w:rPr>
-          <w:rFonts w:hint="eastAsia" w:ascii="仿宋" w:hAnsi="仿宋" w:eastAsia="仿宋" w:cs="仿宋"/>
-          <w:b w:val="0"/>
-          <w:color w:val="000000"/>
-          <w:sz w:val="32"/>
-        </w:rPr>
-      </w:pPr>
-      <w:r>
-        <w:rPr>
-          <w:rFonts w:hint="eastAsia" w:ascii="仿宋" w:hAnsi="仿宋" w:eastAsia="仿宋" w:cs="仿宋"/>
-          <w:b w:val="0"/>
-          <w:color w:val="000000"/>
-          <w:sz w:val="32"/>
-        </w:rPr>
-        <w:t>“自主可控”与”建设外包”并非矛盾，而是分工不同、互为支撑。公司自主做好顶层设计，明确”要什么、建成什么样”，外包负责”怎么建、用什么技术建”——这种模式下，公司不用担心被供应商”绑架”，因为蓝图是自己画的、标准是自己定的，外包只是按图施工的”施工队”；同时，公司也不用因为力量不足而无限期拖延，因为落地实施由专业的外包力量来完成。</w:t>
-      </w:r>
-    </w:p>
-    <w:p>
-      <w:pPr>
-        <w:pStyle w:val="3"/>
-        <w:spacing w:before="0" w:after="0" w:line="560" w:lineRule="exact"/>
-        <w:ind w:left="0" w:firstLine="640" w:firstLineChars="200"/>
-        <w:jc w:val="both"/>
-        <w:rPr>
-          <w:rFonts w:hint="eastAsia" w:ascii="仿宋" w:hAnsi="仿宋" w:eastAsia="仿宋" w:cs="仿宋"/>
-          <w:b w:val="0"/>
-          <w:color w:val="000000"/>
-          <w:sz w:val="32"/>
-        </w:rPr>
-      </w:pPr>
-      <w:r>
-        <w:rPr>
-          <w:rFonts w:hint="eastAsia" w:ascii="仿宋" w:hAnsi="仿宋" w:eastAsia="仿宋" w:cs="仿宋"/>
-          <w:b w:val="0"/>
-          <w:color w:val="000000"/>
-          <w:sz w:val="32"/>
-        </w:rPr>
-        <w:t>④长期价值</w:t>
-      </w:r>
-    </w:p>
-    <w:p>
-      <w:pPr>
-        <w:pStyle w:val="3"/>
-        <w:spacing w:before="0" w:after="0" w:line="560" w:lineRule="exact"/>
-        <w:ind w:left="0" w:firstLine="640" w:firstLineChars="200"/>
-        <w:jc w:val="both"/>
-        <w:rPr>
-          <w:rFonts w:hint="eastAsia" w:ascii="仿宋" w:hAnsi="仿宋" w:eastAsia="仿宋" w:cs="仿宋"/>
-          <w:b w:val="0"/>
-          <w:color w:val="000000"/>
-          <w:sz w:val="32"/>
-        </w:rPr>
-      </w:pPr>
-      <w:r>
-        <w:rPr>
-          <w:rFonts w:hint="eastAsia" w:ascii="仿宋" w:hAnsi="仿宋" w:eastAsia="仿宋" w:cs="仿宋"/>
-          <w:b w:val="0"/>
-          <w:color w:val="000000"/>
-          <w:sz w:val="32"/>
-        </w:rPr>
-        <w:t>通过”自主可控、建设外包”的策略，公司可以在1—2年内快速拿到可用的平台，在业务跑通的同时，内部团队通过全程跟学跟建逐步建立自主维护能力，最终实现”外包实施→内部维护”的平滑过渡。这是一个”既能快速拿到结果、又能持续积累能力”的最优路径。</w:t>
-      </w:r>
-    </w:p>
-    <w:p>
-      <w:pPr>
-        <w:pStyle w:val="3"/>
-        <w:spacing w:before="0" w:after="0" w:line="560" w:lineRule="exact"/>
-        <w:ind w:left="0" w:firstLine="640" w:firstLineChars="200"/>
-        <w:jc w:val="both"/>
-        <w:rPr>
-          <w:rFonts w:hint="eastAsia" w:ascii="黑体" w:hAnsi="黑体" w:eastAsia="黑体" w:cs="黑体"/>
-          <w:b w:val="0"/>
-          <w:color w:val="000000"/>
-          <w:sz w:val="32"/>
-        </w:rPr>
-      </w:pPr>
-      <w:r>
-        <w:rPr>
-          <w:rFonts w:hint="eastAsia" w:ascii="黑体" w:hAnsi="黑体" w:eastAsia="黑体" w:cs="黑体"/>
-          <w:b w:val="0"/>
-          <w:color w:val="000000"/>
-          <w:sz w:val="32"/>
-        </w:rPr>
-        <w:t>二、关于平台策略由”C端先行”调整为”B端先行”</w:t>
-      </w:r>
-    </w:p>
-    <w:p>
-      <w:pPr>
-        <w:pStyle w:val="3"/>
-        <w:spacing w:before="0" w:after="240" w:line="560" w:lineRule="exact"/>
-        <w:ind w:left="0" w:firstLine="640" w:firstLineChars="200"/>
-        <w:jc w:val="both"/>
-        <w:rPr>
-          <w:rFonts w:hint="eastAsia" w:ascii="仿宋" w:hAnsi="仿宋" w:eastAsia="仿宋" w:cs="仿宋"/>
-          <w:b w:val="0"/>
-          <w:color w:val="000000"/>
-          <w:sz w:val="32"/>
-        </w:rPr>
-      </w:pPr>
-      <w:r>
-        <w:rPr>
-          <w:rFonts w:hint="eastAsia" w:ascii="仿宋" w:hAnsi="仿宋" w:eastAsia="仿宋" w:cs="仿宋"/>
-          <w:b w:val="0"/>
+        <w:t>二、　关于平台策略由”C端先行”调整为”B端先行”</w:t>
+      </w:r>
+    </w:p>
+    <w:p>
+      <w:pPr>
+        <w:pStyle w:val="5"/>
+        <w:spacing w:before="0" w:after="480" w:line="560" w:lineRule="exact"/>
+        <w:ind w:left="0" w:firstLine="643" w:firstLineChars="200"/>
+        <w:jc w:val="both"/>
+        <w:rPr>
+          <w:rFonts w:hint="eastAsia" w:ascii="楷体" w:hAnsi="楷体" w:eastAsia="楷体" w:cs="楷体"/>
+          <w:b/>
+          <w:color w:val="000000"/>
+          <w:sz w:val="32"/>
+        </w:rPr>
+      </w:pPr>
+      <w:bookmarkStart w:id="4" w:name="一b端是高频可沉淀的c端是低频不可沉淀的"/>
+      <w:r>
+        <w:rPr>
+          <w:rFonts w:hint="eastAsia" w:ascii="楷体" w:hAnsi="楷体" w:eastAsia="楷体" w:cs="楷体"/>
+          <w:b/>
           <w:color w:val="000000"/>
           <w:sz w:val="32"/>
         </w:rPr>
         <w:t>（一）B端是高频、可沉淀的，C端是低频、不可沉淀的</w:t>
-      </w:r>
-    </w:p>
-    <w:tbl>
-      <w:tblPr>
-        <w:tblStyle w:val="41"/>
-        <w:tblW w:w="5000" w:type="pct"/>
-        <w:tblInd w:w="0" w:type="dxa"/>
-        <w:tblBorders>
-          <w:top w:val="single" w:color="000000" w:sz="8" w:space="0"/>
-          <w:left w:val="single" w:color="000000" w:sz="8" w:space="0"/>
-          <w:bottom w:val="single" w:color="000000" w:sz="8" w:space="0"/>
-          <w:right w:val="single" w:color="000000" w:sz="8" w:space="0"/>
-          <w:insideH w:val="single" w:color="000000" w:sz="8" w:space="0"/>
-          <w:insideV w:val="single" w:color="000000" w:sz="8" w:space="0"/>
-        </w:tblBorders>
-        <w:tblLayout w:type="fixed"/>
-        <w:tblCellMar>
-          <w:top w:w="170" w:type="dxa"/>
-          <w:left w:w="283" w:type="dxa"/>
-          <w:bottom w:w="170" w:type="dxa"/>
-          <w:right w:w="283" w:type="dxa"/>
-        </w:tblCellMar>
-      </w:tblPr>
-      <w:tblGrid>
-        <w:gridCol w:w="3069"/>
-        <w:gridCol w:w="3069"/>
-        <w:gridCol w:w="3069"/>
-      </w:tblGrid>
-      <w:tr>
-        <w:tblPrEx>
-          <w:tblBorders>
-            <w:top w:val="single" w:color="000000" w:sz="8" w:space="0"/>
-            <w:left w:val="single" w:color="000000" w:sz="8" w:space="0"/>
-            <w:bottom w:val="single" w:color="000000" w:sz="8" w:space="0"/>
-            <w:right w:val="single" w:color="000000" w:sz="8" w:space="0"/>
-            <w:insideH w:val="single" w:color="000000" w:sz="8" w:space="0"/>
-            <w:insideV w:val="single" w:color="000000" w:sz="8" w:space="0"/>
-          </w:tblBorders>
-        </w:tblPrEx>
-        <w:tc>
-          <w:tcPr>
-            <w:shd w:val="clear" w:color="auto" w:fill="FFFFFF"/>
-          </w:tcPr>
-          <w:p>
-            <w:pPr>
-              <w:pStyle w:val="24"/>
-              <w:ind w:left="0" w:firstLine="0"/>
-              <w:jc w:val="left"/>
-              <w:rPr>
-                <w:rFonts w:hint="eastAsia" w:ascii="黑体" w:hAnsi="黑体" w:eastAsia="黑体" w:cs="黑体"/>
-                <w:b/>
-                <w:color w:val="000000"/>
-                <w:sz w:val="24"/>
-              </w:rPr>
-            </w:pPr>
-            <w:r>
-              <w:rPr>
-                <w:rFonts w:hint="eastAsia" w:ascii="黑体" w:hAnsi="黑体" w:eastAsia="黑体" w:cs="黑体"/>
-                <w:b/>
-                <w:color w:val="000000"/>
-                <w:sz w:val="24"/>
-              </w:rPr>
-              <w:t>使用频率</w:t>
-            </w:r>
-          </w:p>
-        </w:tc>
-        <w:tc>
-          <w:tcPr>
-            <w:shd w:val="clear" w:color="auto" w:fill="FFFFFF"/>
-          </w:tcPr>
-          <w:p>
-            <w:pPr>
-              <w:pStyle w:val="24"/>
-              <w:ind w:left="0" w:firstLine="0"/>
-              <w:jc w:val="left"/>
-              <w:rPr>
-                <w:rFonts w:hint="eastAsia" w:ascii="宋体" w:hAnsi="宋体" w:eastAsia="宋体" w:cs="宋体"/>
-                <w:b w:val="0"/>
-                <w:color w:val="000000"/>
-                <w:sz w:val="24"/>
-              </w:rPr>
-            </w:pPr>
-            <w:r>
-              <w:rPr>
-                <w:rFonts w:hint="eastAsia" w:ascii="宋体" w:hAnsi="宋体" w:eastAsia="宋体" w:cs="宋体"/>
-                <w:b w:val="0"/>
-                <w:color w:val="000000"/>
-                <w:sz w:val="24"/>
-              </w:rPr>
-              <w:t>日常作业工具，每天打开多次</w:t>
-            </w:r>
-          </w:p>
-        </w:tc>
-        <w:tc>
-          <w:tcPr>
-            <w:shd w:val="clear" w:color="auto" w:fill="FFFFFF"/>
-          </w:tcPr>
-          <w:p>
-            <w:pPr>
-              <w:pStyle w:val="24"/>
-              <w:ind w:left="0" w:firstLine="0"/>
-              <w:jc w:val="left"/>
-              <w:rPr>
-                <w:rFonts w:hint="eastAsia" w:ascii="黑体" w:hAnsi="黑体" w:eastAsia="黑体" w:cs="黑体"/>
-                <w:b/>
-                <w:color w:val="000000"/>
-                <w:sz w:val="24"/>
-              </w:rPr>
-            </w:pPr>
-            <w:r>
-              <w:rPr>
-                <w:rFonts w:hint="eastAsia" w:ascii="黑体" w:hAnsi="黑体" w:eastAsia="黑体" w:cs="黑体"/>
-                <w:b/>
-                <w:color w:val="000000"/>
-                <w:sz w:val="24"/>
-              </w:rPr>
-              <w:t>交易周期内用完即走，一辈子一到两次</w:t>
-            </w:r>
-          </w:p>
-        </w:tc>
-      </w:tr>
-      <w:tr>
-        <w:tblPrEx>
-          <w:tblBorders>
-            <w:top w:val="single" w:color="000000" w:sz="8" w:space="0"/>
-            <w:left w:val="single" w:color="000000" w:sz="8" w:space="0"/>
-            <w:bottom w:val="single" w:color="000000" w:sz="8" w:space="0"/>
-            <w:right w:val="single" w:color="000000" w:sz="8" w:space="0"/>
-            <w:insideH w:val="single" w:color="000000" w:sz="8" w:space="0"/>
-            <w:insideV w:val="single" w:color="000000" w:sz="8" w:space="0"/>
-          </w:tblBorders>
-          <w:tblCellMar>
-            <w:top w:w="170" w:type="dxa"/>
-            <w:left w:w="283" w:type="dxa"/>
-            <w:bottom w:w="170" w:type="dxa"/>
-            <w:right w:w="283" w:type="dxa"/>
-          </w:tblCellMar>
-        </w:tblPrEx>
-        <w:tc>
-          <w:tcPr>
-            <w:shd w:val="clear" w:color="auto" w:fill="FFFFFF"/>
-          </w:tcPr>
-          <w:p>
-            <w:pPr>
-              <w:pStyle w:val="24"/>
-              <w:ind w:left="0" w:firstLine="0"/>
-              <w:jc w:val="left"/>
-              <w:rPr>
-                <w:rFonts w:hint="eastAsia" w:ascii="黑体" w:hAnsi="黑体" w:eastAsia="黑体" w:cs="黑体"/>
-                <w:b/>
-                <w:color w:val="000000"/>
-                <w:sz w:val="24"/>
-              </w:rPr>
-            </w:pPr>
-            <w:r>
-              <w:rPr>
-                <w:rFonts w:hint="eastAsia" w:ascii="黑体" w:hAnsi="黑体" w:eastAsia="黑体" w:cs="黑体"/>
-                <w:b/>
-                <w:color w:val="000000"/>
-                <w:sz w:val="24"/>
-              </w:rPr>
-              <w:t>用户粘性</w:t>
-            </w:r>
-          </w:p>
-        </w:tc>
-        <w:tc>
-          <w:tcPr>
-            <w:shd w:val="clear" w:color="auto" w:fill="FFFFFF"/>
-          </w:tcPr>
-          <w:p>
-            <w:pPr>
-              <w:pStyle w:val="24"/>
-              <w:ind w:left="0" w:firstLine="0"/>
-              <w:jc w:val="left"/>
-              <w:rPr>
-                <w:rFonts w:hint="eastAsia" w:ascii="宋体" w:hAnsi="宋体" w:eastAsia="宋体" w:cs="宋体"/>
-                <w:b w:val="0"/>
-                <w:color w:val="000000"/>
-                <w:sz w:val="24"/>
-              </w:rPr>
-            </w:pPr>
-            <w:r>
-              <w:rPr>
-                <w:rFonts w:hint="eastAsia" w:ascii="宋体" w:hAnsi="宋体" w:eastAsia="宋体" w:cs="宋体"/>
-                <w:b w:val="0"/>
-                <w:color w:val="000000"/>
-                <w:sz w:val="24"/>
-              </w:rPr>
-              <w:t>高，工具和数据积累形成迁移成本</w:t>
-            </w:r>
-          </w:p>
-        </w:tc>
-        <w:tc>
-          <w:tcPr>
-            <w:shd w:val="clear" w:color="auto" w:fill="FFFFFF"/>
-          </w:tcPr>
-          <w:p>
-            <w:pPr>
-              <w:pStyle w:val="24"/>
-              <w:ind w:left="0" w:firstLine="0"/>
-              <w:jc w:val="left"/>
-              <w:rPr>
-                <w:rFonts w:hint="eastAsia" w:ascii="黑体" w:hAnsi="黑体" w:eastAsia="黑体" w:cs="黑体"/>
-                <w:b/>
-                <w:color w:val="000000"/>
-                <w:sz w:val="24"/>
-              </w:rPr>
-            </w:pPr>
-            <w:r>
-              <w:rPr>
-                <w:rFonts w:hint="eastAsia" w:ascii="黑体" w:hAnsi="黑体" w:eastAsia="黑体" w:cs="黑体"/>
-                <w:b/>
-                <w:color w:val="000000"/>
-                <w:sz w:val="24"/>
-              </w:rPr>
-              <w:t>极低，无理由留存</w:t>
-            </w:r>
-          </w:p>
-        </w:tc>
-      </w:tr>
-      <w:tr>
-        <w:tblPrEx>
-          <w:tblBorders>
-            <w:top w:val="single" w:color="000000" w:sz="8" w:space="0"/>
-            <w:left w:val="single" w:color="000000" w:sz="8" w:space="0"/>
-            <w:bottom w:val="single" w:color="000000" w:sz="8" w:space="0"/>
-            <w:right w:val="single" w:color="000000" w:sz="8" w:space="0"/>
-            <w:insideH w:val="single" w:color="000000" w:sz="8" w:space="0"/>
-            <w:insideV w:val="single" w:color="000000" w:sz="8" w:space="0"/>
-          </w:tblBorders>
-          <w:tblCellMar>
-            <w:top w:w="170" w:type="dxa"/>
-            <w:left w:w="283" w:type="dxa"/>
-            <w:bottom w:w="170" w:type="dxa"/>
-            <w:right w:w="283" w:type="dxa"/>
-          </w:tblCellMar>
-        </w:tblPrEx>
-        <w:tc>
-          <w:tcPr>
-            <w:shd w:val="clear" w:color="auto" w:fill="FFFFFF"/>
-          </w:tcPr>
-          <w:p>
-            <w:pPr>
-              <w:pStyle w:val="24"/>
-              <w:ind w:left="0" w:firstLine="0"/>
-              <w:jc w:val="left"/>
-              <w:rPr>
-                <w:rFonts w:hint="eastAsia" w:ascii="黑体" w:hAnsi="黑体" w:eastAsia="黑体" w:cs="黑体"/>
-                <w:b/>
-                <w:color w:val="000000"/>
-                <w:sz w:val="24"/>
-              </w:rPr>
-            </w:pPr>
-            <w:r>
-              <w:rPr>
-                <w:rFonts w:hint="eastAsia" w:ascii="黑体" w:hAnsi="黑体" w:eastAsia="黑体" w:cs="黑体"/>
-                <w:b/>
-                <w:color w:val="000000"/>
-                <w:sz w:val="24"/>
-              </w:rPr>
-              <w:t>可沉淀性</w:t>
-            </w:r>
-          </w:p>
-        </w:tc>
-        <w:tc>
-          <w:tcPr>
-            <w:shd w:val="clear" w:color="auto" w:fill="FFFFFF"/>
-          </w:tcPr>
-          <w:p>
-            <w:pPr>
-              <w:pStyle w:val="24"/>
-              <w:ind w:left="0" w:firstLine="0"/>
-              <w:jc w:val="left"/>
-              <w:rPr>
-                <w:rFonts w:hint="eastAsia" w:ascii="宋体" w:hAnsi="宋体" w:eastAsia="宋体" w:cs="宋体"/>
-                <w:b w:val="0"/>
-                <w:color w:val="000000"/>
-                <w:sz w:val="24"/>
-              </w:rPr>
-            </w:pPr>
-            <w:r>
-              <w:rPr>
-                <w:rFonts w:hint="eastAsia" w:ascii="宋体" w:hAnsi="宋体" w:eastAsia="宋体" w:cs="宋体"/>
-                <w:b w:val="0"/>
-                <w:color w:val="000000"/>
-                <w:sz w:val="24"/>
-              </w:rPr>
-              <w:t>房源库、客户库、成交记录持续积累</w:t>
-            </w:r>
-          </w:p>
-        </w:tc>
-        <w:tc>
-          <w:tcPr>
-            <w:shd w:val="clear" w:color="auto" w:fill="FFFFFF"/>
-          </w:tcPr>
-          <w:p>
-            <w:pPr>
-              <w:pStyle w:val="24"/>
-              <w:ind w:left="0" w:firstLine="0"/>
-              <w:jc w:val="left"/>
-              <w:rPr>
-                <w:rFonts w:hint="eastAsia" w:ascii="黑体" w:hAnsi="黑体" w:eastAsia="黑体" w:cs="黑体"/>
-                <w:b/>
-                <w:color w:val="000000"/>
-                <w:sz w:val="24"/>
-              </w:rPr>
-            </w:pPr>
-            <w:r>
-              <w:rPr>
-                <w:rFonts w:hint="eastAsia" w:ascii="黑体" w:hAnsi="黑体" w:eastAsia="黑体" w:cs="黑体"/>
-                <w:b/>
-                <w:color w:val="000000"/>
-                <w:sz w:val="24"/>
-              </w:rPr>
-              <w:t>交易结束后无持续交互价值</w:t>
-            </w:r>
-          </w:p>
-        </w:tc>
-      </w:tr>
-      <w:tr>
-        <w:tblPrEx>
-          <w:tblBorders>
-            <w:top w:val="single" w:color="000000" w:sz="8" w:space="0"/>
-            <w:left w:val="single" w:color="000000" w:sz="8" w:space="0"/>
-            <w:bottom w:val="single" w:color="000000" w:sz="8" w:space="0"/>
-            <w:right w:val="single" w:color="000000" w:sz="8" w:space="0"/>
-            <w:insideH w:val="single" w:color="000000" w:sz="8" w:space="0"/>
-            <w:insideV w:val="single" w:color="000000" w:sz="8" w:space="0"/>
-          </w:tblBorders>
-          <w:tblCellMar>
-            <w:top w:w="170" w:type="dxa"/>
-            <w:left w:w="283" w:type="dxa"/>
-            <w:bottom w:w="170" w:type="dxa"/>
-            <w:right w:w="283" w:type="dxa"/>
-          </w:tblCellMar>
-        </w:tblPrEx>
-        <w:tc>
-          <w:tcPr>
-            <w:shd w:val="clear" w:color="auto" w:fill="FFFFFF"/>
-          </w:tcPr>
-          <w:p>
-            <w:pPr>
-              <w:pStyle w:val="24"/>
-              <w:ind w:left="0" w:firstLine="0"/>
-              <w:jc w:val="left"/>
-              <w:rPr>
-                <w:rFonts w:hint="eastAsia" w:ascii="黑体" w:hAnsi="黑体" w:eastAsia="黑体" w:cs="黑体"/>
-                <w:b/>
-                <w:color w:val="000000"/>
-                <w:sz w:val="24"/>
-              </w:rPr>
-            </w:pPr>
-            <w:r>
-              <w:rPr>
-                <w:rFonts w:hint="eastAsia" w:ascii="黑体" w:hAnsi="黑体" w:eastAsia="黑体" w:cs="黑体"/>
-                <w:b/>
-                <w:color w:val="000000"/>
-                <w:sz w:val="24"/>
-              </w:rPr>
-              <w:t>决策影响力</w:t>
-            </w:r>
-          </w:p>
-        </w:tc>
-        <w:tc>
-          <w:tcPr>
-            <w:shd w:val="clear" w:color="auto" w:fill="FFFFFF"/>
-          </w:tcPr>
-          <w:p>
-            <w:pPr>
-              <w:pStyle w:val="24"/>
-              <w:ind w:left="0" w:firstLine="0"/>
-              <w:jc w:val="left"/>
-              <w:rPr>
-                <w:rFonts w:hint="eastAsia" w:ascii="宋体" w:hAnsi="宋体" w:eastAsia="宋体" w:cs="宋体"/>
-                <w:b w:val="0"/>
-                <w:color w:val="000000"/>
-                <w:sz w:val="24"/>
-              </w:rPr>
-            </w:pPr>
-            <w:r>
-              <w:rPr>
-                <w:rFonts w:hint="eastAsia" w:ascii="宋体" w:hAnsi="宋体" w:eastAsia="宋体" w:cs="宋体"/>
-                <w:b w:val="0"/>
-                <w:color w:val="000000"/>
-                <w:sz w:val="24"/>
-              </w:rPr>
-              <w:t>专业角色，对C端有强引导力</w:t>
-            </w:r>
-          </w:p>
-        </w:tc>
-        <w:tc>
-          <w:tcPr>
-            <w:shd w:val="clear" w:color="auto" w:fill="FFFFFF"/>
-          </w:tcPr>
-          <w:p>
-            <w:pPr>
-              <w:pStyle w:val="24"/>
-              <w:ind w:left="0" w:firstLine="0"/>
-              <w:jc w:val="left"/>
-              <w:rPr>
-                <w:rFonts w:hint="eastAsia" w:ascii="黑体" w:hAnsi="黑体" w:eastAsia="黑体" w:cs="黑体"/>
-                <w:b/>
-                <w:color w:val="000000"/>
-                <w:sz w:val="24"/>
-              </w:rPr>
-            </w:pPr>
-            <w:r>
-              <w:rPr>
-                <w:rFonts w:hint="eastAsia" w:ascii="黑体" w:hAnsi="黑体" w:eastAsia="黑体" w:cs="黑体"/>
-                <w:b/>
-                <w:color w:val="000000"/>
-                <w:sz w:val="24"/>
-              </w:rPr>
-              <w:t>被动接收信息，决策依赖中介建议</w:t>
-            </w:r>
-          </w:p>
-        </w:tc>
-      </w:tr>
-    </w:tbl>
-    <w:p>
-      <w:pPr>
-        <w:pStyle w:val="3"/>
-        <w:spacing w:before="240" w:after="0" w:line="560" w:lineRule="exact"/>
-        <w:ind w:left="0" w:firstLine="640" w:firstLineChars="200"/>
-        <w:jc w:val="both"/>
-        <w:rPr>
-          <w:rFonts w:hint="eastAsia" w:ascii="仿宋" w:hAnsi="仿宋" w:eastAsia="仿宋" w:cs="仿宋"/>
-          <w:b w:val="0"/>
-          <w:color w:val="000000"/>
-          <w:sz w:val="32"/>
-        </w:rPr>
-      </w:pPr>
-      <w:r>
-        <w:rPr>
-          <w:rFonts w:hint="eastAsia" w:ascii="仿宋" w:hAnsi="仿宋" w:eastAsia="仿宋" w:cs="仿宋"/>
-          <w:b w:val="0"/>
-          <w:color w:val="000000"/>
-          <w:sz w:val="32"/>
-        </w:rPr>
-        <w:t>结论：用低频的C端去拉动高频的B端，是把撬棍插反了。正确的杠杆是用高频的B端沉淀内容和服务，再通过B端去触达和服务C端。</w:t>
-      </w:r>
-    </w:p>
-    <w:p>
-      <w:pPr>
-        <w:pStyle w:val="3"/>
-        <w:spacing w:before="0" w:after="0" w:line="560" w:lineRule="exact"/>
-        <w:ind w:left="0" w:firstLine="640" w:firstLineChars="200"/>
-        <w:jc w:val="both"/>
-        <w:rPr>
-          <w:rFonts w:hint="eastAsia" w:ascii="仿宋" w:hAnsi="仿宋" w:eastAsia="仿宋" w:cs="仿宋"/>
-          <w:b w:val="0"/>
-          <w:color w:val="000000"/>
-          <w:sz w:val="32"/>
-        </w:rPr>
-      </w:pPr>
-      <w:r>
-        <w:rPr>
-          <w:rFonts w:hint="eastAsia" w:ascii="仿宋" w:hAnsi="仿宋" w:eastAsia="仿宋" w:cs="仿宋"/>
-          <w:b w:val="0"/>
-          <w:color w:val="000000"/>
-          <w:sz w:val="32"/>
-        </w:rPr>
-        <w:t>（二）双边市场的规律——“第一推动力”是供给侧</w:t>
-      </w:r>
-    </w:p>
-    <w:p>
-      <w:pPr>
-        <w:pStyle w:val="3"/>
-        <w:spacing w:before="0" w:after="0" w:line="560" w:lineRule="exact"/>
-        <w:ind w:left="0" w:firstLine="640" w:firstLineChars="200"/>
-        <w:jc w:val="both"/>
-        <w:rPr>
-          <w:rFonts w:hint="eastAsia" w:ascii="仿宋" w:hAnsi="仿宋" w:eastAsia="仿宋" w:cs="仿宋"/>
-          <w:b w:val="0"/>
-          <w:color w:val="000000"/>
-          <w:sz w:val="32"/>
-        </w:rPr>
-      </w:pPr>
-      <w:r>
-        <w:rPr>
-          <w:rFonts w:hint="eastAsia" w:ascii="仿宋" w:hAnsi="仿宋" w:eastAsia="仿宋" w:cs="仿宋"/>
-          <w:b w:val="0"/>
-          <w:color w:val="000000"/>
-          <w:sz w:val="32"/>
-        </w:rPr>
-        <w:t>双边市场有一个基本规律：必须先有供给，才能引来需求。</w:t>
-      </w:r>
-    </w:p>
-    <w:p>
-      <w:pPr>
-        <w:pStyle w:val="24"/>
-        <w:numPr>
-          <w:ilvl w:val="0"/>
-          <w:numId w:val="1"/>
-        </w:numPr>
-        <w:spacing w:before="0" w:after="0" w:line="560" w:lineRule="exact"/>
-        <w:ind w:left="0" w:firstLine="640" w:firstLineChars="200"/>
-        <w:jc w:val="both"/>
-        <w:rPr>
-          <w:rFonts w:hint="eastAsia" w:ascii="仿宋" w:hAnsi="仿宋" w:eastAsia="仿宋" w:cs="仿宋"/>
-          <w:b w:val="0"/>
-          <w:color w:val="000000"/>
-          <w:sz w:val="32"/>
-        </w:rPr>
-      </w:pPr>
-      <w:r>
-        <w:rPr>
-          <w:rFonts w:hint="eastAsia" w:ascii="仿宋" w:hAnsi="仿宋" w:eastAsia="仿宋" w:cs="仿宋"/>
-          <w:b w:val="0"/>
-          <w:color w:val="000000"/>
-          <w:sz w:val="32"/>
-        </w:rPr>
-        <w:t>滴滴是先有司机（供给），乘客才有车可打；</w:t>
-      </w:r>
-    </w:p>
-    <w:p>
-      <w:pPr>
-        <w:pStyle w:val="24"/>
-        <w:numPr>
-          <w:ilvl w:val="0"/>
-          <w:numId w:val="1"/>
-        </w:numPr>
-        <w:spacing w:before="0" w:after="0" w:line="560" w:lineRule="exact"/>
-        <w:ind w:left="0" w:firstLine="640" w:firstLineChars="200"/>
-        <w:jc w:val="both"/>
-        <w:rPr>
-          <w:rFonts w:hint="eastAsia" w:ascii="仿宋" w:hAnsi="仿宋" w:eastAsia="仿宋" w:cs="仿宋"/>
-          <w:b w:val="0"/>
-          <w:color w:val="000000"/>
-          <w:sz w:val="32"/>
-        </w:rPr>
-      </w:pPr>
-      <w:r>
-        <w:rPr>
-          <w:rFonts w:hint="eastAsia" w:ascii="仿宋" w:hAnsi="仿宋" w:eastAsia="仿宋" w:cs="仿宋"/>
-          <w:b w:val="0"/>
-          <w:color w:val="000000"/>
-          <w:sz w:val="32"/>
-        </w:rPr>
-        <w:t>美团是先有餐厅（供给），用户才有饭可点；</w:t>
-      </w:r>
-    </w:p>
-    <w:p>
-      <w:pPr>
-        <w:pStyle w:val="24"/>
-        <w:numPr>
-          <w:ilvl w:val="0"/>
-          <w:numId w:val="1"/>
-        </w:numPr>
-        <w:spacing w:before="0" w:after="0" w:line="560" w:lineRule="exact"/>
-        <w:ind w:left="0" w:firstLine="640" w:firstLineChars="200"/>
-        <w:jc w:val="both"/>
-        <w:rPr>
-          <w:rFonts w:hint="eastAsia" w:ascii="仿宋" w:hAnsi="仿宋" w:eastAsia="仿宋" w:cs="仿宋"/>
-          <w:b w:val="0"/>
-          <w:color w:val="000000"/>
-          <w:sz w:val="32"/>
-        </w:rPr>
-      </w:pPr>
-      <w:r>
-        <w:rPr>
-          <w:rFonts w:hint="eastAsia" w:ascii="仿宋" w:hAnsi="仿宋" w:eastAsia="仿宋" w:cs="仿宋"/>
-          <w:b w:val="0"/>
-          <w:color w:val="000000"/>
-          <w:sz w:val="32"/>
-        </w:rPr>
-        <w:t>贝壳是先有经纪人（供给），购房者才有房可看。</w:t>
-      </w:r>
-    </w:p>
-    <w:p>
-      <w:pPr>
-        <w:pStyle w:val="23"/>
-        <w:spacing w:before="0" w:after="0" w:line="560" w:lineRule="exact"/>
-        <w:ind w:left="0" w:firstLine="640" w:firstLineChars="200"/>
-        <w:jc w:val="both"/>
-        <w:rPr>
-          <w:rFonts w:hint="eastAsia" w:ascii="仿宋" w:hAnsi="仿宋" w:eastAsia="仿宋" w:cs="仿宋"/>
-          <w:b w:val="0"/>
-          <w:color w:val="000000"/>
-          <w:sz w:val="32"/>
-        </w:rPr>
-      </w:pPr>
-      <w:r>
-        <w:rPr>
-          <w:rFonts w:hint="eastAsia" w:ascii="仿宋" w:hAnsi="仿宋" w:eastAsia="仿宋" w:cs="仿宋"/>
-          <w:b w:val="0"/>
-          <w:color w:val="000000"/>
-          <w:sz w:val="32"/>
-        </w:rPr>
-        <w:t>同样的逻辑：平台必须先有中介入驻、有房源共享、有联卖网络，C端用户来了才有东西可看、有人可服务。先推C端，用户来了发现房源少、中介少，体验差、口碑差，再想拉回来成本极高。</w:t>
-      </w:r>
-    </w:p>
-    <w:p>
-      <w:pPr>
-        <w:pStyle w:val="3"/>
-        <w:spacing w:before="0" w:after="0" w:line="560" w:lineRule="exact"/>
-        <w:ind w:left="0" w:firstLine="640" w:firstLineChars="200"/>
-        <w:jc w:val="both"/>
-        <w:rPr>
-          <w:rFonts w:hint="eastAsia" w:ascii="仿宋" w:hAnsi="仿宋" w:eastAsia="仿宋" w:cs="仿宋"/>
-          <w:b w:val="0"/>
-          <w:color w:val="000000"/>
-          <w:sz w:val="32"/>
-        </w:rPr>
-      </w:pPr>
-      <w:r>
-        <w:rPr>
-          <w:rFonts w:hint="eastAsia" w:ascii="仿宋" w:hAnsi="仿宋" w:eastAsia="仿宋" w:cs="仿宋"/>
-          <w:b w:val="0"/>
-          <w:color w:val="000000"/>
-          <w:sz w:val="32"/>
-        </w:rPr>
-        <w:t>（三）C端决策高度依赖中介引导，先推C端会被中介”截流”</w:t>
-      </w:r>
-    </w:p>
-    <w:p>
-      <w:pPr>
-        <w:pStyle w:val="3"/>
-        <w:spacing w:before="0" w:after="0" w:line="560" w:lineRule="exact"/>
-        <w:ind w:left="0" w:firstLine="640" w:firstLineChars="200"/>
-        <w:jc w:val="both"/>
-        <w:rPr>
-          <w:rFonts w:hint="eastAsia" w:ascii="仿宋" w:hAnsi="仿宋" w:eastAsia="仿宋" w:cs="仿宋"/>
-          <w:b w:val="0"/>
-          <w:color w:val="000000"/>
-          <w:sz w:val="32"/>
-        </w:rPr>
-      </w:pPr>
-      <w:r>
-        <w:rPr>
-          <w:rFonts w:hint="eastAsia" w:ascii="仿宋" w:hAnsi="仿宋" w:eastAsia="仿宋" w:cs="仿宋"/>
-          <w:b w:val="0"/>
-          <w:color w:val="000000"/>
-          <w:sz w:val="32"/>
-        </w:rPr>
-        <w:t>这是最关键的洞察。即使C端客户一开始通过平台了解到了自主交易方案，但大部分客户在交易决策过程中，仍然会咨询中介、依赖中介的专业建议。中介有天然的客户关系和信任基础，只要一句话——“你这个情况我们帮你处理更稳妥”，客户就被截流了。</w:t>
-      </w:r>
-    </w:p>
-    <w:p>
-      <w:pPr>
-        <w:pStyle w:val="3"/>
-        <w:spacing w:before="0" w:after="0" w:line="560" w:lineRule="exact"/>
-        <w:ind w:left="0" w:firstLine="640" w:firstLineChars="200"/>
-        <w:jc w:val="both"/>
-        <w:rPr>
-          <w:rFonts w:hint="eastAsia" w:ascii="仿宋" w:hAnsi="仿宋" w:eastAsia="仿宋" w:cs="仿宋"/>
-          <w:b w:val="0"/>
-          <w:color w:val="000000"/>
-          <w:sz w:val="32"/>
-        </w:rPr>
-      </w:pPr>
-      <w:r>
-        <w:rPr>
-          <w:rFonts w:hint="eastAsia" w:ascii="仿宋" w:hAnsi="仿宋" w:eastAsia="仿宋" w:cs="仿宋"/>
-          <w:b w:val="0"/>
-          <w:color w:val="000000"/>
-          <w:sz w:val="32"/>
-        </w:rPr>
-        <w:t>我们的平台如果无法影响中介的行为，就无法真正影响C端的结果。只有让B端先用起来、用顺手、离不开了，他们才会主动把客户带到平台上来。B端才是我们触达C端最有效的渠道。</w:t>
-      </w:r>
-    </w:p>
-    <w:p>
-      <w:pPr>
-        <w:pStyle w:val="3"/>
-        <w:spacing w:before="0" w:after="240" w:line="560" w:lineRule="exact"/>
-        <w:ind w:left="0" w:firstLine="640" w:firstLineChars="200"/>
-        <w:jc w:val="both"/>
-        <w:rPr>
-          <w:rFonts w:hint="eastAsia" w:ascii="仿宋" w:hAnsi="仿宋" w:eastAsia="仿宋" w:cs="仿宋"/>
-          <w:b w:val="0"/>
-          <w:color w:val="000000"/>
-          <w:sz w:val="32"/>
-        </w:rPr>
-      </w:pPr>
-      <w:r>
-        <w:rPr>
-          <w:rFonts w:hint="eastAsia" w:ascii="仿宋" w:hAnsi="仿宋" w:eastAsia="仿宋" w:cs="仿宋"/>
-          <w:b w:val="0"/>
-          <w:color w:val="000000"/>
-          <w:sz w:val="32"/>
-        </w:rPr>
-        <w:t>（四）案例佐证</w:t>
       </w:r>
     </w:p>
     <w:tbl>
@@ -1073,6 +397,700 @@
                 <w:color w:val="000000"/>
                 <w:sz w:val="24"/>
               </w:rPr>
+              <w:t>使用频率</w:t>
+            </w:r>
+          </w:p>
+        </w:tc>
+        <w:tc>
+          <w:tcPr>
+            <w:shd w:val="clear" w:color="auto" w:fill="FFFFFF"/>
+          </w:tcPr>
+          <w:p>
+            <w:pPr>
+              <w:pStyle w:val="24"/>
+              <w:ind w:left="0" w:firstLine="0"/>
+              <w:jc w:val="left"/>
+              <w:rPr>
+                <w:rFonts w:hint="eastAsia" w:ascii="宋体" w:hAnsi="宋体" w:eastAsia="宋体" w:cs="宋体"/>
+                <w:b w:val="0"/>
+                <w:color w:val="000000"/>
+                <w:sz w:val="24"/>
+              </w:rPr>
+            </w:pPr>
+            <w:r>
+              <w:rPr>
+                <w:rFonts w:hint="eastAsia" w:ascii="宋体" w:hAnsi="宋体" w:eastAsia="宋体" w:cs="宋体"/>
+                <w:b w:val="0"/>
+                <w:color w:val="000000"/>
+                <w:sz w:val="24"/>
+              </w:rPr>
+              <w:t>日常作业工具，每天打开多次</w:t>
+            </w:r>
+          </w:p>
+        </w:tc>
+        <w:tc>
+          <w:tcPr>
+            <w:shd w:val="clear" w:color="auto" w:fill="FFFFFF"/>
+          </w:tcPr>
+          <w:p>
+            <w:pPr>
+              <w:pStyle w:val="24"/>
+              <w:ind w:left="0" w:firstLine="0"/>
+              <w:jc w:val="left"/>
+              <w:rPr>
+                <w:rFonts w:hint="eastAsia" w:ascii="黑体" w:hAnsi="黑体" w:eastAsia="黑体" w:cs="黑体"/>
+                <w:b/>
+                <w:color w:val="000000"/>
+                <w:sz w:val="24"/>
+              </w:rPr>
+            </w:pPr>
+            <w:r>
+              <w:rPr>
+                <w:rFonts w:hint="eastAsia" w:ascii="黑体" w:hAnsi="黑体" w:eastAsia="黑体" w:cs="黑体"/>
+                <w:b/>
+                <w:color w:val="000000"/>
+                <w:sz w:val="24"/>
+              </w:rPr>
+              <w:t>交易周期内用完即走，一辈子一到两次</w:t>
+            </w:r>
+          </w:p>
+        </w:tc>
+      </w:tr>
+      <w:tr>
+        <w:tblPrEx>
+          <w:tblBorders>
+            <w:top w:val="single" w:color="000000" w:sz="8" w:space="0"/>
+            <w:left w:val="single" w:color="000000" w:sz="8" w:space="0"/>
+            <w:bottom w:val="single" w:color="000000" w:sz="8" w:space="0"/>
+            <w:right w:val="single" w:color="000000" w:sz="8" w:space="0"/>
+            <w:insideH w:val="single" w:color="000000" w:sz="8" w:space="0"/>
+            <w:insideV w:val="single" w:color="000000" w:sz="8" w:space="0"/>
+          </w:tblBorders>
+          <w:tblCellMar>
+            <w:top w:w="170" w:type="dxa"/>
+            <w:left w:w="283" w:type="dxa"/>
+            <w:bottom w:w="170" w:type="dxa"/>
+            <w:right w:w="283" w:type="dxa"/>
+          </w:tblCellMar>
+        </w:tblPrEx>
+        <w:tc>
+          <w:tcPr>
+            <w:shd w:val="clear" w:color="auto" w:fill="FFFFFF"/>
+          </w:tcPr>
+          <w:p>
+            <w:pPr>
+              <w:pStyle w:val="24"/>
+              <w:ind w:left="0" w:firstLine="0"/>
+              <w:jc w:val="left"/>
+              <w:rPr>
+                <w:rFonts w:hint="eastAsia" w:ascii="黑体" w:hAnsi="黑体" w:eastAsia="黑体" w:cs="黑体"/>
+                <w:b/>
+                <w:color w:val="000000"/>
+                <w:sz w:val="24"/>
+              </w:rPr>
+            </w:pPr>
+            <w:r>
+              <w:rPr>
+                <w:rFonts w:hint="eastAsia" w:ascii="黑体" w:hAnsi="黑体" w:eastAsia="黑体" w:cs="黑体"/>
+                <w:b/>
+                <w:color w:val="000000"/>
+                <w:sz w:val="24"/>
+              </w:rPr>
+              <w:t>用户粘性</w:t>
+            </w:r>
+          </w:p>
+        </w:tc>
+        <w:tc>
+          <w:tcPr>
+            <w:shd w:val="clear" w:color="auto" w:fill="FFFFFF"/>
+          </w:tcPr>
+          <w:p>
+            <w:pPr>
+              <w:pStyle w:val="24"/>
+              <w:ind w:left="0" w:firstLine="0"/>
+              <w:jc w:val="left"/>
+              <w:rPr>
+                <w:rFonts w:hint="eastAsia" w:ascii="宋体" w:hAnsi="宋体" w:eastAsia="宋体" w:cs="宋体"/>
+                <w:b w:val="0"/>
+                <w:color w:val="000000"/>
+                <w:sz w:val="24"/>
+              </w:rPr>
+            </w:pPr>
+            <w:r>
+              <w:rPr>
+                <w:rFonts w:hint="eastAsia" w:ascii="宋体" w:hAnsi="宋体" w:eastAsia="宋体" w:cs="宋体"/>
+                <w:b w:val="0"/>
+                <w:color w:val="000000"/>
+                <w:sz w:val="24"/>
+              </w:rPr>
+              <w:t>高，工具和数据积累形成迁移成本</w:t>
+            </w:r>
+          </w:p>
+        </w:tc>
+        <w:tc>
+          <w:tcPr>
+            <w:shd w:val="clear" w:color="auto" w:fill="FFFFFF"/>
+          </w:tcPr>
+          <w:p>
+            <w:pPr>
+              <w:pStyle w:val="24"/>
+              <w:ind w:left="0" w:firstLine="0"/>
+              <w:jc w:val="left"/>
+              <w:rPr>
+                <w:rFonts w:hint="eastAsia" w:ascii="黑体" w:hAnsi="黑体" w:eastAsia="黑体" w:cs="黑体"/>
+                <w:b/>
+                <w:color w:val="000000"/>
+                <w:sz w:val="24"/>
+              </w:rPr>
+            </w:pPr>
+            <w:r>
+              <w:rPr>
+                <w:rFonts w:hint="eastAsia" w:ascii="黑体" w:hAnsi="黑体" w:eastAsia="黑体" w:cs="黑体"/>
+                <w:b/>
+                <w:color w:val="000000"/>
+                <w:sz w:val="24"/>
+              </w:rPr>
+              <w:t>极低，无理由留存</w:t>
+            </w:r>
+          </w:p>
+        </w:tc>
+      </w:tr>
+      <w:tr>
+        <w:tblPrEx>
+          <w:tblBorders>
+            <w:top w:val="single" w:color="000000" w:sz="8" w:space="0"/>
+            <w:left w:val="single" w:color="000000" w:sz="8" w:space="0"/>
+            <w:bottom w:val="single" w:color="000000" w:sz="8" w:space="0"/>
+            <w:right w:val="single" w:color="000000" w:sz="8" w:space="0"/>
+            <w:insideH w:val="single" w:color="000000" w:sz="8" w:space="0"/>
+            <w:insideV w:val="single" w:color="000000" w:sz="8" w:space="0"/>
+          </w:tblBorders>
+          <w:tblCellMar>
+            <w:top w:w="170" w:type="dxa"/>
+            <w:left w:w="283" w:type="dxa"/>
+            <w:bottom w:w="170" w:type="dxa"/>
+            <w:right w:w="283" w:type="dxa"/>
+          </w:tblCellMar>
+        </w:tblPrEx>
+        <w:tc>
+          <w:tcPr>
+            <w:shd w:val="clear" w:color="auto" w:fill="FFFFFF"/>
+          </w:tcPr>
+          <w:p>
+            <w:pPr>
+              <w:pStyle w:val="24"/>
+              <w:ind w:left="0" w:firstLine="0"/>
+              <w:jc w:val="left"/>
+              <w:rPr>
+                <w:rFonts w:hint="eastAsia" w:ascii="黑体" w:hAnsi="黑体" w:eastAsia="黑体" w:cs="黑体"/>
+                <w:b/>
+                <w:color w:val="000000"/>
+                <w:sz w:val="24"/>
+              </w:rPr>
+            </w:pPr>
+            <w:r>
+              <w:rPr>
+                <w:rFonts w:hint="eastAsia" w:ascii="黑体" w:hAnsi="黑体" w:eastAsia="黑体" w:cs="黑体"/>
+                <w:b/>
+                <w:color w:val="000000"/>
+                <w:sz w:val="24"/>
+              </w:rPr>
+              <w:t>可沉淀性</w:t>
+            </w:r>
+          </w:p>
+        </w:tc>
+        <w:tc>
+          <w:tcPr>
+            <w:shd w:val="clear" w:color="auto" w:fill="FFFFFF"/>
+          </w:tcPr>
+          <w:p>
+            <w:pPr>
+              <w:pStyle w:val="24"/>
+              <w:ind w:left="0" w:firstLine="0"/>
+              <w:jc w:val="left"/>
+              <w:rPr>
+                <w:rFonts w:hint="eastAsia" w:ascii="宋体" w:hAnsi="宋体" w:eastAsia="宋体" w:cs="宋体"/>
+                <w:b w:val="0"/>
+                <w:color w:val="000000"/>
+                <w:sz w:val="24"/>
+              </w:rPr>
+            </w:pPr>
+            <w:r>
+              <w:rPr>
+                <w:rFonts w:hint="eastAsia" w:ascii="宋体" w:hAnsi="宋体" w:eastAsia="宋体" w:cs="宋体"/>
+                <w:b w:val="0"/>
+                <w:color w:val="000000"/>
+                <w:sz w:val="24"/>
+              </w:rPr>
+              <w:t>房源库、客户库、成交记录持续积累</w:t>
+            </w:r>
+          </w:p>
+        </w:tc>
+        <w:tc>
+          <w:tcPr>
+            <w:shd w:val="clear" w:color="auto" w:fill="FFFFFF"/>
+          </w:tcPr>
+          <w:p>
+            <w:pPr>
+              <w:pStyle w:val="24"/>
+              <w:ind w:left="0" w:firstLine="0"/>
+              <w:jc w:val="left"/>
+              <w:rPr>
+                <w:rFonts w:hint="eastAsia" w:ascii="黑体" w:hAnsi="黑体" w:eastAsia="黑体" w:cs="黑体"/>
+                <w:b/>
+                <w:color w:val="000000"/>
+                <w:sz w:val="24"/>
+              </w:rPr>
+            </w:pPr>
+            <w:r>
+              <w:rPr>
+                <w:rFonts w:hint="eastAsia" w:ascii="黑体" w:hAnsi="黑体" w:eastAsia="黑体" w:cs="黑体"/>
+                <w:b/>
+                <w:color w:val="000000"/>
+                <w:sz w:val="24"/>
+              </w:rPr>
+              <w:t>交易结束后无持续交互价值</w:t>
+            </w:r>
+          </w:p>
+        </w:tc>
+      </w:tr>
+      <w:tr>
+        <w:tblPrEx>
+          <w:tblBorders>
+            <w:top w:val="single" w:color="000000" w:sz="8" w:space="0"/>
+            <w:left w:val="single" w:color="000000" w:sz="8" w:space="0"/>
+            <w:bottom w:val="single" w:color="000000" w:sz="8" w:space="0"/>
+            <w:right w:val="single" w:color="000000" w:sz="8" w:space="0"/>
+            <w:insideH w:val="single" w:color="000000" w:sz="8" w:space="0"/>
+            <w:insideV w:val="single" w:color="000000" w:sz="8" w:space="0"/>
+          </w:tblBorders>
+          <w:tblCellMar>
+            <w:top w:w="170" w:type="dxa"/>
+            <w:left w:w="283" w:type="dxa"/>
+            <w:bottom w:w="170" w:type="dxa"/>
+            <w:right w:w="283" w:type="dxa"/>
+          </w:tblCellMar>
+        </w:tblPrEx>
+        <w:tc>
+          <w:tcPr>
+            <w:shd w:val="clear" w:color="auto" w:fill="FFFFFF"/>
+          </w:tcPr>
+          <w:p>
+            <w:pPr>
+              <w:pStyle w:val="24"/>
+              <w:ind w:left="0" w:firstLine="0"/>
+              <w:jc w:val="left"/>
+              <w:rPr>
+                <w:rFonts w:hint="eastAsia" w:ascii="黑体" w:hAnsi="黑体" w:eastAsia="黑体" w:cs="黑体"/>
+                <w:b/>
+                <w:color w:val="000000"/>
+                <w:sz w:val="24"/>
+              </w:rPr>
+            </w:pPr>
+            <w:r>
+              <w:rPr>
+                <w:rFonts w:hint="eastAsia" w:ascii="黑体" w:hAnsi="黑体" w:eastAsia="黑体" w:cs="黑体"/>
+                <w:b/>
+                <w:color w:val="000000"/>
+                <w:sz w:val="24"/>
+              </w:rPr>
+              <w:t>决策影响力</w:t>
+            </w:r>
+          </w:p>
+        </w:tc>
+        <w:tc>
+          <w:tcPr>
+            <w:shd w:val="clear" w:color="auto" w:fill="FFFFFF"/>
+          </w:tcPr>
+          <w:p>
+            <w:pPr>
+              <w:pStyle w:val="24"/>
+              <w:ind w:left="0" w:firstLine="0"/>
+              <w:jc w:val="left"/>
+              <w:rPr>
+                <w:rFonts w:hint="eastAsia" w:ascii="宋体" w:hAnsi="宋体" w:eastAsia="宋体" w:cs="宋体"/>
+                <w:b w:val="0"/>
+                <w:color w:val="000000"/>
+                <w:sz w:val="24"/>
+              </w:rPr>
+            </w:pPr>
+            <w:r>
+              <w:rPr>
+                <w:rFonts w:hint="eastAsia" w:ascii="宋体" w:hAnsi="宋体" w:eastAsia="宋体" w:cs="宋体"/>
+                <w:b w:val="0"/>
+                <w:color w:val="000000"/>
+                <w:sz w:val="24"/>
+              </w:rPr>
+              <w:t>专业角色，对C端有强引导力</w:t>
+            </w:r>
+          </w:p>
+        </w:tc>
+        <w:tc>
+          <w:tcPr>
+            <w:shd w:val="clear" w:color="auto" w:fill="FFFFFF"/>
+          </w:tcPr>
+          <w:p>
+            <w:pPr>
+              <w:pStyle w:val="24"/>
+              <w:ind w:left="0" w:firstLine="0"/>
+              <w:jc w:val="left"/>
+              <w:rPr>
+                <w:rFonts w:hint="eastAsia" w:ascii="黑体" w:hAnsi="黑体" w:eastAsia="黑体" w:cs="黑体"/>
+                <w:b/>
+                <w:color w:val="000000"/>
+                <w:sz w:val="24"/>
+              </w:rPr>
+            </w:pPr>
+            <w:r>
+              <w:rPr>
+                <w:rFonts w:hint="eastAsia" w:ascii="黑体" w:hAnsi="黑体" w:eastAsia="黑体" w:cs="黑体"/>
+                <w:b/>
+                <w:color w:val="000000"/>
+                <w:sz w:val="24"/>
+              </w:rPr>
+              <w:t>被动接收信息，决策依赖中介建议</w:t>
+            </w:r>
+          </w:p>
+        </w:tc>
+      </w:tr>
+    </w:tbl>
+    <w:p>
+      <w:pPr>
+        <w:pStyle w:val="3"/>
+        <w:spacing w:before="480" w:after="0" w:line="560" w:lineRule="exact"/>
+        <w:ind w:left="0" w:firstLine="640" w:firstLineChars="200"/>
+        <w:jc w:val="both"/>
+        <w:rPr>
+          <w:rFonts w:hint="eastAsia" w:ascii="仿宋" w:hAnsi="仿宋" w:eastAsia="仿宋" w:cs="仿宋"/>
+          <w:b w:val="0"/>
+          <w:color w:val="000000"/>
+          <w:sz w:val="32"/>
+        </w:rPr>
+      </w:pPr>
+      <w:r>
+        <w:rPr>
+          <w:rFonts w:hint="eastAsia" w:ascii="仿宋" w:hAnsi="仿宋" w:eastAsia="仿宋" w:cs="仿宋"/>
+          <w:b w:val="0"/>
+          <w:color w:val="000000"/>
+          <w:sz w:val="32"/>
+        </w:rPr>
+        <w:t>结论：用低频的C端去拉动高频的B端，是把撬棍插反了。正确的杠杆是用高频的B端沉淀内容和服务，再通过B端去触达和服务C端。</w:t>
+      </w:r>
+    </w:p>
+    <w:bookmarkEnd w:id="4"/>
+    <w:p>
+      <w:pPr>
+        <w:pStyle w:val="5"/>
+        <w:spacing w:before="0" w:after="0" w:line="560" w:lineRule="exact"/>
+        <w:ind w:left="0" w:firstLine="643" w:firstLineChars="200"/>
+        <w:jc w:val="both"/>
+        <w:rPr>
+          <w:rFonts w:hint="eastAsia" w:ascii="楷体" w:hAnsi="楷体" w:eastAsia="楷体" w:cs="楷体"/>
+          <w:b/>
+          <w:color w:val="000000"/>
+          <w:sz w:val="32"/>
+        </w:rPr>
+      </w:pPr>
+      <w:bookmarkStart w:id="5" w:name="二双边市场的规律第一推动力是供给侧"/>
+      <w:r>
+        <w:rPr>
+          <w:rFonts w:hint="eastAsia" w:ascii="楷体" w:hAnsi="楷体" w:eastAsia="楷体" w:cs="楷体"/>
+          <w:b/>
+          <w:color w:val="000000"/>
+          <w:sz w:val="32"/>
+        </w:rPr>
+        <w:t>（二）双边市场的规律——“第一推动力”是供给侧</w:t>
+      </w:r>
+    </w:p>
+    <w:p>
+      <w:pPr>
+        <w:pStyle w:val="23"/>
+        <w:spacing w:before="0" w:after="0" w:line="560" w:lineRule="exact"/>
+        <w:ind w:left="0" w:firstLine="640" w:firstLineChars="200"/>
+        <w:jc w:val="both"/>
+        <w:rPr>
+          <w:rFonts w:hint="eastAsia" w:ascii="仿宋" w:hAnsi="仿宋" w:eastAsia="仿宋" w:cs="仿宋"/>
+          <w:b w:val="0"/>
+          <w:color w:val="000000"/>
+          <w:sz w:val="32"/>
+        </w:rPr>
+      </w:pPr>
+      <w:r>
+        <w:rPr>
+          <w:rFonts w:hint="eastAsia" w:ascii="仿宋" w:hAnsi="仿宋" w:eastAsia="仿宋" w:cs="仿宋"/>
+          <w:b w:val="0"/>
+          <w:color w:val="000000"/>
+          <w:sz w:val="32"/>
+        </w:rPr>
+        <w:t>双边市场有一个基本规律：必须先有供给，才能引来需求。</w:t>
+      </w:r>
+    </w:p>
+    <w:p>
+      <w:pPr>
+        <w:pStyle w:val="24"/>
+        <w:numPr>
+          <w:ilvl w:val="0"/>
+          <w:numId w:val="1"/>
+        </w:numPr>
+        <w:spacing w:before="0" w:after="0" w:line="560" w:lineRule="exact"/>
+        <w:ind w:left="0" w:firstLine="640" w:firstLineChars="200"/>
+        <w:jc w:val="both"/>
+        <w:rPr>
+          <w:rFonts w:hint="eastAsia" w:ascii="仿宋" w:hAnsi="仿宋" w:eastAsia="仿宋" w:cs="仿宋"/>
+          <w:b w:val="0"/>
+          <w:color w:val="000000"/>
+          <w:sz w:val="32"/>
+        </w:rPr>
+      </w:pPr>
+      <w:r>
+        <w:rPr>
+          <w:rFonts w:hint="eastAsia" w:ascii="仿宋" w:hAnsi="仿宋" w:eastAsia="仿宋" w:cs="仿宋"/>
+          <w:b w:val="0"/>
+          <w:color w:val="000000"/>
+          <w:sz w:val="32"/>
+        </w:rPr>
+        <w:t>滴滴是先有司机（供给），乘客才有车可打；</w:t>
+      </w:r>
+    </w:p>
+    <w:p>
+      <w:pPr>
+        <w:pStyle w:val="24"/>
+        <w:numPr>
+          <w:ilvl w:val="0"/>
+          <w:numId w:val="1"/>
+        </w:numPr>
+        <w:spacing w:before="0" w:after="0" w:line="560" w:lineRule="exact"/>
+        <w:ind w:left="0" w:firstLine="640" w:firstLineChars="200"/>
+        <w:jc w:val="both"/>
+        <w:rPr>
+          <w:rFonts w:hint="eastAsia" w:ascii="仿宋" w:hAnsi="仿宋" w:eastAsia="仿宋" w:cs="仿宋"/>
+          <w:b w:val="0"/>
+          <w:color w:val="000000"/>
+          <w:sz w:val="32"/>
+        </w:rPr>
+      </w:pPr>
+      <w:r>
+        <w:rPr>
+          <w:rFonts w:hint="eastAsia" w:ascii="仿宋" w:hAnsi="仿宋" w:eastAsia="仿宋" w:cs="仿宋"/>
+          <w:b w:val="0"/>
+          <w:color w:val="000000"/>
+          <w:sz w:val="32"/>
+        </w:rPr>
+        <w:t>美团是先有餐厅（供给），用户才有饭可点；</w:t>
+      </w:r>
+    </w:p>
+    <w:p>
+      <w:pPr>
+        <w:pStyle w:val="24"/>
+        <w:numPr>
+          <w:ilvl w:val="0"/>
+          <w:numId w:val="1"/>
+        </w:numPr>
+        <w:spacing w:before="0" w:after="0" w:line="560" w:lineRule="exact"/>
+        <w:ind w:left="0" w:firstLine="640" w:firstLineChars="200"/>
+        <w:jc w:val="both"/>
+        <w:rPr>
+          <w:rFonts w:hint="eastAsia" w:ascii="仿宋" w:hAnsi="仿宋" w:eastAsia="仿宋" w:cs="仿宋"/>
+          <w:b w:val="0"/>
+          <w:color w:val="000000"/>
+          <w:sz w:val="32"/>
+        </w:rPr>
+      </w:pPr>
+      <w:r>
+        <w:rPr>
+          <w:rFonts w:hint="eastAsia" w:ascii="仿宋" w:hAnsi="仿宋" w:eastAsia="仿宋" w:cs="仿宋"/>
+          <w:b w:val="0"/>
+          <w:color w:val="000000"/>
+          <w:sz w:val="32"/>
+        </w:rPr>
+        <w:t>贝壳是先有经纪人（供给），购房者才有房可看。</w:t>
+      </w:r>
+    </w:p>
+    <w:p>
+      <w:pPr>
+        <w:pStyle w:val="23"/>
+        <w:spacing w:before="0" w:after="0" w:line="560" w:lineRule="exact"/>
+        <w:ind w:left="0" w:firstLine="640" w:firstLineChars="200"/>
+        <w:jc w:val="both"/>
+        <w:rPr>
+          <w:rFonts w:hint="eastAsia" w:ascii="仿宋" w:hAnsi="仿宋" w:eastAsia="仿宋" w:cs="仿宋"/>
+          <w:b w:val="0"/>
+          <w:color w:val="000000"/>
+          <w:sz w:val="32"/>
+        </w:rPr>
+      </w:pPr>
+      <w:r>
+        <w:rPr>
+          <w:rFonts w:hint="eastAsia" w:ascii="仿宋" w:hAnsi="仿宋" w:eastAsia="仿宋" w:cs="仿宋"/>
+          <w:b w:val="0"/>
+          <w:color w:val="000000"/>
+          <w:sz w:val="32"/>
+        </w:rPr>
+        <w:t>同样的逻辑：平台必须先有中介入驻、有房源共享、有联卖网络，C端用户来了才有东西可看、有人可服务。先推C端，用户来了发现房源少、中介少，体验差、口碑差，再想拉回来成本极高。</w:t>
+      </w:r>
+    </w:p>
+    <w:bookmarkEnd w:id="5"/>
+    <w:p>
+      <w:pPr>
+        <w:pStyle w:val="5"/>
+        <w:spacing w:before="0" w:after="0" w:line="560" w:lineRule="exact"/>
+        <w:ind w:left="0" w:firstLine="643" w:firstLineChars="200"/>
+        <w:jc w:val="both"/>
+        <w:rPr>
+          <w:rFonts w:hint="eastAsia" w:ascii="楷体" w:hAnsi="楷体" w:eastAsia="楷体" w:cs="楷体"/>
+          <w:b/>
+          <w:color w:val="000000"/>
+          <w:sz w:val="32"/>
+        </w:rPr>
+      </w:pPr>
+      <w:bookmarkStart w:id="6" w:name="三c端决策高度依赖中介引导先推c端会被中介截流"/>
+      <w:r>
+        <w:rPr>
+          <w:rFonts w:hint="eastAsia" w:ascii="楷体" w:hAnsi="楷体" w:eastAsia="楷体" w:cs="楷体"/>
+          <w:b/>
+          <w:color w:val="000000"/>
+          <w:sz w:val="32"/>
+        </w:rPr>
+        <w:t>（三）C端决策高度依赖中介引导，先推C端会被中介”截流”</w:t>
+      </w:r>
+    </w:p>
+    <w:p>
+      <w:pPr>
+        <w:pStyle w:val="23"/>
+        <w:spacing w:before="0" w:after="0" w:line="560" w:lineRule="exact"/>
+        <w:ind w:left="0" w:firstLine="640" w:firstLineChars="200"/>
+        <w:jc w:val="both"/>
+        <w:rPr>
+          <w:rFonts w:hint="eastAsia" w:ascii="仿宋" w:hAnsi="仿宋" w:eastAsia="仿宋" w:cs="仿宋"/>
+          <w:b w:val="0"/>
+          <w:color w:val="000000"/>
+          <w:sz w:val="32"/>
+        </w:rPr>
+      </w:pPr>
+      <w:r>
+        <w:rPr>
+          <w:rFonts w:hint="eastAsia" w:ascii="仿宋" w:hAnsi="仿宋" w:eastAsia="仿宋" w:cs="仿宋"/>
+          <w:b w:val="0"/>
+          <w:color w:val="000000"/>
+          <w:sz w:val="32"/>
+        </w:rPr>
+        <w:t>这是最关键的洞察。即使C端客户一开始通过平台了解到了自主交易方案，但大部分客户在交易决策过程中，仍然会咨询中介、依赖中介的专业建议。中介有天然的客户关系和信任基础，只要一句话——“你这个情况我们帮你处理更稳妥”，客户就被截流了。</w:t>
+      </w:r>
+    </w:p>
+    <w:p>
+      <w:pPr>
+        <w:pStyle w:val="3"/>
+        <w:spacing w:before="0" w:after="0" w:line="560" w:lineRule="exact"/>
+        <w:ind w:left="0" w:firstLine="640" w:firstLineChars="200"/>
+        <w:jc w:val="both"/>
+        <w:rPr>
+          <w:rFonts w:hint="eastAsia" w:ascii="仿宋" w:hAnsi="仿宋" w:eastAsia="仿宋" w:cs="仿宋"/>
+          <w:b w:val="0"/>
+          <w:color w:val="000000"/>
+          <w:sz w:val="32"/>
+        </w:rPr>
+      </w:pPr>
+      <w:r>
+        <w:rPr>
+          <w:rFonts w:hint="eastAsia" w:ascii="仿宋" w:hAnsi="仿宋" w:eastAsia="仿宋" w:cs="仿宋"/>
+          <w:b w:val="0"/>
+          <w:color w:val="000000"/>
+          <w:sz w:val="32"/>
+        </w:rPr>
+        <w:t>我们的平台如果无法影响中介的行为，就无法真正影响C端的结果。只有让B端先用起来、用顺手、离不开了，他们才会主动把客户带到平台上来。B端才是我们触达C端最有效的渠道。</w:t>
+      </w:r>
+    </w:p>
+    <w:bookmarkEnd w:id="6"/>
+    <w:p>
+      <w:pPr>
+        <w:pStyle w:val="5"/>
+        <w:spacing w:before="0" w:after="480" w:line="560" w:lineRule="exact"/>
+        <w:ind w:left="0" w:firstLine="643" w:firstLineChars="200"/>
+        <w:jc w:val="both"/>
+        <w:rPr>
+          <w:rFonts w:hint="eastAsia" w:ascii="楷体" w:hAnsi="楷体" w:eastAsia="楷体" w:cs="楷体"/>
+          <w:b/>
+          <w:color w:val="000000"/>
+          <w:sz w:val="32"/>
+        </w:rPr>
+      </w:pPr>
+      <w:bookmarkStart w:id="7" w:name="四案例佐证"/>
+      <w:r>
+        <w:rPr>
+          <w:rFonts w:hint="eastAsia" w:ascii="楷体" w:hAnsi="楷体" w:eastAsia="楷体" w:cs="楷体"/>
+          <w:b/>
+          <w:color w:val="000000"/>
+          <w:sz w:val="32"/>
+        </w:rPr>
+        <w:t>（四）案例佐证</w:t>
+      </w:r>
+    </w:p>
+    <w:tbl>
+      <w:tblPr>
+        <w:tblStyle w:val="41"/>
+        <w:tblW w:w="5000" w:type="pct"/>
+        <w:tblInd w:w="0" w:type="dxa"/>
+        <w:tblBorders>
+          <w:top w:val="single" w:color="000000" w:sz="8" w:space="0"/>
+          <w:left w:val="single" w:color="000000" w:sz="8" w:space="0"/>
+          <w:bottom w:val="single" w:color="000000" w:sz="8" w:space="0"/>
+          <w:right w:val="single" w:color="000000" w:sz="8" w:space="0"/>
+          <w:insideH w:val="single" w:color="000000" w:sz="8" w:space="0"/>
+          <w:insideV w:val="single" w:color="000000" w:sz="8" w:space="0"/>
+        </w:tblBorders>
+        <w:tblLayout w:type="fixed"/>
+        <w:tblCellMar>
+          <w:top w:w="170" w:type="dxa"/>
+          <w:left w:w="283" w:type="dxa"/>
+          <w:bottom w:w="170" w:type="dxa"/>
+          <w:right w:w="283" w:type="dxa"/>
+        </w:tblCellMar>
+      </w:tblPr>
+      <w:tblGrid>
+        <w:gridCol w:w="3069"/>
+        <w:gridCol w:w="3069"/>
+        <w:gridCol w:w="3069"/>
+      </w:tblGrid>
+      <w:tr>
+        <w:tblPrEx>
+          <w:tblBorders>
+            <w:top w:val="single" w:color="000000" w:sz="8" w:space="0"/>
+            <w:left w:val="single" w:color="000000" w:sz="8" w:space="0"/>
+            <w:bottom w:val="single" w:color="000000" w:sz="8" w:space="0"/>
+            <w:right w:val="single" w:color="000000" w:sz="8" w:space="0"/>
+            <w:insideH w:val="single" w:color="000000" w:sz="8" w:space="0"/>
+            <w:insideV w:val="single" w:color="000000" w:sz="8" w:space="0"/>
+          </w:tblBorders>
+          <w:tblCellMar>
+            <w:top w:w="170" w:type="dxa"/>
+            <w:left w:w="283" w:type="dxa"/>
+            <w:bottom w:w="170" w:type="dxa"/>
+            <w:right w:w="283" w:type="dxa"/>
+          </w:tblCellMar>
+        </w:tblPrEx>
+        <w:tc>
+          <w:tcPr>
+            <w:shd w:val="clear" w:color="auto" w:fill="FFFFFF"/>
+          </w:tcPr>
+          <w:p>
+            <w:pPr>
+              <w:pStyle w:val="24"/>
+              <w:ind w:left="0" w:firstLine="0"/>
+              <w:jc w:val="left"/>
+              <w:rPr>
+                <w:rFonts w:hint="eastAsia" w:ascii="黑体" w:hAnsi="黑体" w:eastAsia="黑体" w:cs="黑体"/>
+                <w:b/>
+                <w:color w:val="000000"/>
+                <w:sz w:val="24"/>
+              </w:rPr>
+            </w:pPr>
+            <w:r>
+              <w:rPr>
+                <w:rFonts w:hint="eastAsia" w:ascii="黑体" w:hAnsi="黑体" w:eastAsia="黑体" w:cs="黑体"/>
+                <w:b/>
+                <w:color w:val="000000"/>
+                <w:sz w:val="24"/>
+              </w:rPr>
               <w:t>贝壳找房</w:t>
             </w:r>
           </w:p>
@@ -1330,13 +1348,15 @@
           </w:p>
         </w:tc>
       </w:tr>
+      <w:bookmarkEnd w:id="3"/>
+      <w:bookmarkEnd w:id="7"/>
     </w:tbl>
     <w:p>
       <w:pPr>
-        <w:pStyle w:val="3"/>
-        <w:spacing w:before="240" w:after="0" w:line="560" w:lineRule="exact"/>
-        <w:ind w:left="0" w:firstLine="640" w:firstLineChars="200"/>
-        <w:jc w:val="both"/>
+        <w:pStyle w:val="4"/>
+        <w:spacing w:before="480" w:after="720" w:line="560" w:lineRule="exact"/>
+        <w:ind w:left="0" w:firstLine="0" w:firstLineChars="0"/>
+        <w:jc w:val="left"/>
         <w:rPr>
           <w:rFonts w:hint="eastAsia" w:ascii="黑体" w:hAnsi="黑体" w:eastAsia="黑体" w:cs="黑体"/>
           <w:b w:val="0"/>
@@ -1344,6 +1364,7 @@
           <w:sz w:val="32"/>
         </w:rPr>
       </w:pPr>
+      <w:bookmarkStart w:id="8" w:name="三关于五年计划实施路径和年度行动计划"/>
       <w:r>
         <w:rPr>
           <w:rFonts w:hint="eastAsia" w:ascii="黑体" w:hAnsi="黑体" w:eastAsia="黑体" w:cs="黑体"/>
@@ -1351,26 +1372,27 @@
           <w:color w:val="000000"/>
           <w:sz w:val="32"/>
         </w:rPr>
-        <w:t>三、关于五年计划实施路径和年度行动计划</w:t>
-      </w:r>
-    </w:p>
-    <w:p>
-      <w:pPr>
-        <w:pStyle w:val="3"/>
-        <w:spacing w:before="0" w:after="0" w:line="560" w:lineRule="exact"/>
-        <w:ind w:left="0" w:firstLine="640" w:firstLineChars="200"/>
-        <w:jc w:val="both"/>
-        <w:rPr>
-          <w:rFonts w:hint="eastAsia" w:ascii="仿宋" w:hAnsi="仿宋" w:eastAsia="仿宋" w:cs="仿宋"/>
-          <w:b w:val="0"/>
-          <w:color w:val="000000"/>
-          <w:sz w:val="32"/>
-        </w:rPr>
-      </w:pPr>
-      <w:r>
-        <w:rPr>
-          <w:rFonts w:hint="eastAsia" w:ascii="仿宋" w:hAnsi="仿宋" w:eastAsia="仿宋" w:cs="仿宋"/>
-          <w:b w:val="0"/>
+        <w:t>三、　关于五年计划实施路径和年度行动计划</w:t>
+      </w:r>
+    </w:p>
+    <w:p>
+      <w:pPr>
+        <w:pStyle w:val="5"/>
+        <w:spacing w:before="0" w:after="0" w:line="560" w:lineRule="exact"/>
+        <w:ind w:left="0" w:firstLine="643" w:firstLineChars="200"/>
+        <w:jc w:val="both"/>
+        <w:rPr>
+          <w:rFonts w:hint="eastAsia" w:ascii="楷体" w:hAnsi="楷体" w:eastAsia="楷体" w:cs="楷体"/>
+          <w:b/>
+          <w:color w:val="000000"/>
+          <w:sz w:val="32"/>
+        </w:rPr>
+      </w:pPr>
+      <w:bookmarkStart w:id="9" w:name="一原计划"/>
+      <w:r>
+        <w:rPr>
+          <w:rFonts w:hint="eastAsia" w:ascii="楷体" w:hAnsi="楷体" w:eastAsia="楷体" w:cs="楷体"/>
+          <w:b/>
           <w:color w:val="000000"/>
           <w:sz w:val="32"/>
         </w:rPr>
@@ -1379,8 +1401,8 @@
     </w:p>
     <w:p>
       <w:pPr>
-        <w:pStyle w:val="3"/>
-        <w:spacing w:before="0" w:after="240" w:line="560" w:lineRule="exact"/>
+        <w:pStyle w:val="23"/>
+        <w:spacing w:before="0" w:after="480" w:line="560" w:lineRule="exact"/>
         <w:ind w:left="0" w:firstLine="640" w:firstLineChars="200"/>
         <w:jc w:val="both"/>
         <w:rPr>
@@ -1721,24 +1743,26 @@
           </w:p>
         </w:tc>
       </w:tr>
+      <w:bookmarkEnd w:id="9"/>
     </w:tbl>
     <w:p>
       <w:pPr>
-        <w:pStyle w:val="3"/>
-        <w:spacing w:before="240" w:after="0" w:line="560" w:lineRule="exact"/>
-        <w:ind w:left="0" w:firstLine="640" w:firstLineChars="200"/>
-        <w:jc w:val="both"/>
-        <w:rPr>
-          <w:rFonts w:hint="eastAsia" w:ascii="仿宋" w:hAnsi="仿宋" w:eastAsia="仿宋" w:cs="仿宋"/>
-          <w:b w:val="0"/>
-          <w:color w:val="000000"/>
-          <w:sz w:val="32"/>
-        </w:rPr>
-      </w:pPr>
-      <w:r>
-        <w:rPr>
-          <w:rFonts w:hint="eastAsia" w:ascii="仿宋" w:hAnsi="仿宋" w:eastAsia="仿宋" w:cs="仿宋"/>
-          <w:b w:val="0"/>
+        <w:pStyle w:val="5"/>
+        <w:spacing w:before="480" w:after="0" w:line="560" w:lineRule="exact"/>
+        <w:ind w:left="0" w:firstLine="643" w:firstLineChars="200"/>
+        <w:jc w:val="both"/>
+        <w:rPr>
+          <w:rFonts w:hint="eastAsia" w:ascii="楷体" w:hAnsi="楷体" w:eastAsia="楷体" w:cs="楷体"/>
+          <w:b/>
+          <w:color w:val="000000"/>
+          <w:sz w:val="32"/>
+        </w:rPr>
+      </w:pPr>
+      <w:bookmarkStart w:id="10" w:name="二建议改成"/>
+      <w:r>
+        <w:rPr>
+          <w:rFonts w:hint="eastAsia" w:ascii="楷体" w:hAnsi="楷体" w:eastAsia="楷体" w:cs="楷体"/>
+          <w:b/>
           <w:color w:val="000000"/>
           <w:sz w:val="32"/>
         </w:rPr>
@@ -1747,8 +1771,8 @@
     </w:p>
     <w:p>
       <w:pPr>
-        <w:pStyle w:val="3"/>
-        <w:spacing w:before="0" w:after="240" w:line="560" w:lineRule="exact"/>
+        <w:pStyle w:val="23"/>
+        <w:spacing w:before="0" w:after="480" w:line="560" w:lineRule="exact"/>
         <w:ind w:left="0" w:firstLine="640" w:firstLineChars="200"/>
         <w:jc w:val="both"/>
         <w:rPr>
@@ -2089,24 +2113,26 @@
           </w:p>
         </w:tc>
       </w:tr>
+      <w:bookmarkEnd w:id="10"/>
     </w:tbl>
     <w:p>
       <w:pPr>
-        <w:pStyle w:val="3"/>
-        <w:spacing w:before="240" w:after="0" w:line="560" w:lineRule="exact"/>
-        <w:ind w:left="0" w:firstLine="640" w:firstLineChars="200"/>
-        <w:jc w:val="both"/>
-        <w:rPr>
-          <w:rFonts w:hint="eastAsia" w:ascii="仿宋" w:hAnsi="仿宋" w:eastAsia="仿宋" w:cs="仿宋"/>
-          <w:b w:val="0"/>
-          <w:color w:val="000000"/>
-          <w:sz w:val="32"/>
-        </w:rPr>
-      </w:pPr>
-      <w:r>
-        <w:rPr>
-          <w:rFonts w:hint="eastAsia" w:ascii="仿宋" w:hAnsi="仿宋" w:eastAsia="仿宋" w:cs="仿宋"/>
-          <w:b w:val="0"/>
+        <w:pStyle w:val="5"/>
+        <w:spacing w:before="480" w:after="0" w:line="560" w:lineRule="exact"/>
+        <w:ind w:left="0" w:firstLine="643" w:firstLineChars="200"/>
+        <w:jc w:val="both"/>
+        <w:rPr>
+          <w:rFonts w:hint="eastAsia" w:ascii="楷体" w:hAnsi="楷体" w:eastAsia="楷体" w:cs="楷体"/>
+          <w:b/>
+          <w:color w:val="000000"/>
+          <w:sz w:val="32"/>
+        </w:rPr>
+      </w:pPr>
+      <w:bookmarkStart w:id="11" w:name="三原因一对平台的理解深度不足需要先想清楚再动手做"/>
+      <w:r>
+        <w:rPr>
+          <w:rFonts w:hint="eastAsia" w:ascii="楷体" w:hAnsi="楷体" w:eastAsia="楷体" w:cs="楷体"/>
+          <w:b/>
           <w:color w:val="000000"/>
           <w:sz w:val="32"/>
         </w:rPr>
@@ -2115,7 +2141,7 @@
     </w:p>
     <w:p>
       <w:pPr>
-        <w:pStyle w:val="3"/>
+        <w:pStyle w:val="23"/>
         <w:spacing w:before="0" w:after="0" w:line="560" w:lineRule="exact"/>
         <w:ind w:left="0" w:firstLine="640" w:firstLineChars="200"/>
         <w:jc w:val="both"/>
@@ -2282,56 +2308,58 @@
         <w:t>结论：在需求尚未充分论证、架构尚未清晰的情况下，贸然启动开发，做出来的东西大概率不是业务真正需要的，后续推倒重来的成本远高于现在多花几个月把设计做扎实。</w:t>
       </w:r>
     </w:p>
+    <w:bookmarkEnd w:id="11"/>
+    <w:p>
+      <w:pPr>
+        <w:pStyle w:val="5"/>
+        <w:spacing w:before="0" w:after="0" w:line="560" w:lineRule="exact"/>
+        <w:ind w:left="0" w:firstLine="643" w:firstLineChars="200"/>
+        <w:jc w:val="both"/>
+        <w:rPr>
+          <w:rFonts w:hint="eastAsia" w:ascii="楷体" w:hAnsi="楷体" w:eastAsia="楷体" w:cs="楷体"/>
+          <w:b/>
+          <w:color w:val="000000"/>
+          <w:sz w:val="32"/>
+        </w:rPr>
+      </w:pPr>
+      <w:bookmarkStart w:id="12" w:name="四原因二平台的建设路径尚未最终确定前期选型工作决定项目成败"/>
+      <w:r>
+        <w:rPr>
+          <w:rFonts w:hint="eastAsia" w:ascii="楷体" w:hAnsi="楷体" w:eastAsia="楷体" w:cs="楷体"/>
+          <w:b/>
+          <w:color w:val="000000"/>
+          <w:sz w:val="32"/>
+        </w:rPr>
+        <w:t>（四）原因二：平台的建设路径尚未最终确定，前期选型工作决定项目成败</w:t>
+      </w:r>
+    </w:p>
+    <w:p>
+      <w:pPr>
+        <w:pStyle w:val="23"/>
+        <w:spacing w:before="0" w:after="0" w:line="560" w:lineRule="exact"/>
+        <w:ind w:left="0" w:firstLine="640" w:firstLineChars="200"/>
+        <w:jc w:val="both"/>
+        <w:rPr>
+          <w:rFonts w:hint="eastAsia" w:ascii="仿宋" w:hAnsi="仿宋" w:eastAsia="仿宋" w:cs="仿宋"/>
+          <w:b w:val="0"/>
+          <w:color w:val="000000"/>
+          <w:sz w:val="32"/>
+        </w:rPr>
+      </w:pPr>
+      <w:r>
+        <w:rPr>
+          <w:rFonts w:hint="eastAsia" w:ascii="仿宋" w:hAnsi="仿宋" w:eastAsia="仿宋" w:cs="仿宋"/>
+          <w:b w:val="0"/>
+          <w:color w:val="000000"/>
+          <w:sz w:val="32"/>
+        </w:rPr>
+        <w:t>现状分析：</w:t>
+      </w:r>
+    </w:p>
     <w:p>
       <w:pPr>
         <w:pStyle w:val="3"/>
-        <w:spacing w:before="0" w:after="0" w:line="560" w:lineRule="exact"/>
-        <w:ind w:left="0" w:firstLine="640" w:firstLineChars="200"/>
-        <w:jc w:val="both"/>
-        <w:rPr>
-          <w:rFonts w:hint="eastAsia" w:ascii="仿宋" w:hAnsi="仿宋" w:eastAsia="仿宋" w:cs="仿宋"/>
-          <w:b w:val="0"/>
-          <w:color w:val="000000"/>
-          <w:sz w:val="32"/>
-        </w:rPr>
-      </w:pPr>
-      <w:r>
-        <w:rPr>
-          <w:rFonts w:hint="eastAsia" w:ascii="仿宋" w:hAnsi="仿宋" w:eastAsia="仿宋" w:cs="仿宋"/>
-          <w:b w:val="0"/>
-          <w:color w:val="000000"/>
-          <w:sz w:val="32"/>
-        </w:rPr>
-        <w:t>（四）原因二：平台的建设路径尚未最终确定，前期选型工作决定项目成败</w:t>
-      </w:r>
-    </w:p>
-    <w:p>
-      <w:pPr>
-        <w:pStyle w:val="3"/>
-        <w:spacing w:before="0" w:after="0" w:line="560" w:lineRule="exact"/>
-        <w:ind w:left="0" w:firstLine="640" w:firstLineChars="200"/>
-        <w:jc w:val="both"/>
-        <w:rPr>
-          <w:rFonts w:hint="eastAsia" w:ascii="仿宋" w:hAnsi="仿宋" w:eastAsia="仿宋" w:cs="仿宋"/>
-          <w:b w:val="0"/>
-          <w:color w:val="000000"/>
-          <w:sz w:val="32"/>
-        </w:rPr>
-      </w:pPr>
-      <w:r>
-        <w:rPr>
-          <w:rFonts w:hint="eastAsia" w:ascii="仿宋" w:hAnsi="仿宋" w:eastAsia="仿宋" w:cs="仿宋"/>
-          <w:b w:val="0"/>
-          <w:color w:val="000000"/>
-          <w:sz w:val="32"/>
-        </w:rPr>
-        <w:t>现状分析：</w:t>
-      </w:r>
-    </w:p>
-    <w:p>
-      <w:pPr>
-        <w:pStyle w:val="3"/>
-        <w:spacing w:before="0" w:after="240" w:line="560" w:lineRule="exact"/>
+        <w:spacing w:before="0" w:after="480" w:line="560" w:lineRule="exact"/>
         <w:ind w:left="0" w:firstLine="640" w:firstLineChars="200"/>
         <w:jc w:val="both"/>
         <w:rPr>
@@ -2608,7 +2636,7 @@
                 <w:sz w:val="24"/>
               </w:rPr>
             </w:pPr>
-            <w:bookmarkStart w:id="1" w:name="_GoBack" w:colFirst="2" w:colLast="2"/>
+            <w:bookmarkStart w:id="20" w:name="_GoBack" w:colFirst="2" w:colLast="2"/>
             <w:r>
               <w:rPr>
                 <w:rFonts w:hint="eastAsia" w:ascii="黑体" w:hAnsi="黑体" w:eastAsia="黑体" w:cs="黑体"/>
@@ -2675,7 +2703,7 @@
           </w:p>
         </w:tc>
       </w:tr>
-      <w:bookmarkEnd w:id="1"/>
+      <w:bookmarkEnd w:id="20"/>
     </w:tbl>
     <w:p>
       <w:pPr>
@@ -2684,7 +2712,7 @@
           <w:ilvl w:val="0"/>
           <w:numId w:val="1"/>
         </w:numPr>
-        <w:spacing w:before="240" w:after="0" w:line="560" w:lineRule="exact"/>
+        <w:spacing w:before="480" w:after="0" w:line="560" w:lineRule="exact"/>
         <w:ind w:left="0" w:firstLine="640" w:firstLineChars="200"/>
         <w:jc w:val="both"/>
         <w:rPr>
@@ -2758,6 +2786,56 @@
         <w:t>选型决定了”第二阶段”的投入。我们现在的选择，直接决定了未来是否需要大规模重构。前期多花三个月做好选型，可能省掉后期一年的重构投入。前期的调研和设计工作，其重要性不亚于系统开发本身。</w:t>
       </w:r>
     </w:p>
+    <w:bookmarkEnd w:id="8"/>
+    <w:bookmarkEnd w:id="12"/>
+    <w:p>
+      <w:pPr>
+        <w:pStyle w:val="4"/>
+        <w:spacing w:before="0" w:after="720" w:line="560" w:lineRule="exact"/>
+        <w:ind w:left="0" w:firstLine="0" w:firstLineChars="0"/>
+        <w:jc w:val="left"/>
+        <w:rPr>
+          <w:rFonts w:hint="eastAsia" w:ascii="黑体" w:hAnsi="黑体" w:eastAsia="黑体" w:cs="黑体"/>
+          <w:b w:val="0"/>
+          <w:color w:val="000000"/>
+          <w:sz w:val="32"/>
+        </w:rPr>
+      </w:pPr>
+      <w:bookmarkStart w:id="13" w:name="四关于平台技术底座建议以ai原生思路建设做好迎接商业逻辑重构的准备"/>
+      <w:r>
+        <w:rPr>
+          <w:rFonts w:hint="eastAsia" w:ascii="黑体" w:hAnsi="黑体" w:eastAsia="黑体" w:cs="黑体"/>
+          <w:b w:val="0"/>
+          <w:color w:val="000000"/>
+          <w:sz w:val="32"/>
+        </w:rPr>
+        <w:t>四、　关于平台技术底座——建议以”AI原生”思路建设，做好迎接商业逻辑重构的准备</w:t>
+      </w:r>
+    </w:p>
+    <w:p>
+      <w:pPr>
+        <w:pStyle w:val="5"/>
+        <w:spacing w:before="0" w:after="0" w:line="560" w:lineRule="exact"/>
+        <w:ind w:left="0" w:firstLine="643" w:firstLineChars="200"/>
+        <w:jc w:val="both"/>
+        <w:rPr>
+          <w:rFonts w:hint="eastAsia" w:ascii="楷体" w:hAnsi="楷体" w:eastAsia="楷体" w:cs="楷体"/>
+          <w:b/>
+          <w:color w:val="000000"/>
+          <w:sz w:val="32"/>
+        </w:rPr>
+      </w:pPr>
+      <w:bookmarkStart w:id="14" w:name="一修改点一"/>
+      <w:r>
+        <w:rPr>
+          <w:rFonts w:hint="eastAsia" w:ascii="楷体" w:hAnsi="楷体" w:eastAsia="楷体" w:cs="楷体"/>
+          <w:b/>
+          <w:color w:val="000000"/>
+          <w:sz w:val="32"/>
+        </w:rPr>
+        <w:t>（一）修改点一</w:t>
+      </w:r>
+    </w:p>
     <w:p>
       <w:pPr>
         <w:pStyle w:val="23"/>
@@ -2765,20 +2843,112 @@
         <w:ind w:left="0" w:firstLine="640" w:firstLineChars="200"/>
         <w:jc w:val="both"/>
         <w:rPr>
-          <w:rFonts w:hint="eastAsia" w:ascii="黑体" w:hAnsi="黑体" w:eastAsia="黑体" w:cs="黑体"/>
-          <w:b w:val="0"/>
-          <w:color w:val="000000"/>
-          <w:sz w:val="32"/>
-        </w:rPr>
-      </w:pPr>
-      <w:r>
-        <w:rPr>
-          <w:rFonts w:hint="eastAsia" w:ascii="黑体" w:hAnsi="黑体" w:eastAsia="黑体" w:cs="黑体"/>
-          <w:b w:val="0"/>
-          <w:color w:val="000000"/>
-          <w:sz w:val="32"/>
-        </w:rPr>
-        <w:t>四、关于平台技术底座——建议以”AI原生”思路建设，做好迎接商业逻辑重构的准备</w:t>
+          <w:rFonts w:hint="eastAsia" w:ascii="仿宋" w:hAnsi="仿宋" w:eastAsia="仿宋" w:cs="仿宋"/>
+          <w:b w:val="0"/>
+          <w:color w:val="000000"/>
+          <w:sz w:val="32"/>
+        </w:rPr>
+      </w:pPr>
+      <w:r>
+        <w:rPr>
+          <w:rFonts w:hint="eastAsia" w:ascii="仿宋" w:hAnsi="仿宋" w:eastAsia="仿宋" w:cs="仿宋"/>
+          <w:b w:val="0"/>
+          <w:color w:val="000000"/>
+          <w:sz w:val="32"/>
+        </w:rPr>
+        <w:t>原文（第二章·外部环境研判·技术环境）：</w:t>
+      </w:r>
+    </w:p>
+    <w:p>
+      <w:pPr>
+        <w:pStyle w:val="13"/>
+        <w:spacing w:before="0" w:after="0" w:line="560" w:lineRule="exact"/>
+        <w:ind w:left="0" w:firstLine="640" w:firstLineChars="200"/>
+        <w:jc w:val="both"/>
+        <w:rPr>
+          <w:rFonts w:hint="eastAsia" w:ascii="仿宋" w:hAnsi="仿宋" w:eastAsia="仿宋" w:cs="仿宋"/>
+          <w:b w:val="0"/>
+          <w:color w:val="000000"/>
+          <w:sz w:val="32"/>
+        </w:rPr>
+      </w:pPr>
+      <w:r>
+        <w:rPr>
+          <w:rFonts w:hint="eastAsia" w:ascii="仿宋" w:hAnsi="仿宋" w:eastAsia="仿宋" w:cs="仿宋"/>
+          <w:b w:val="0"/>
+          <w:color w:val="000000"/>
+          <w:sz w:val="32"/>
+        </w:rPr>
+        <w:t>自媒体平台的去中心化传播与AI技术的深度应用，正在解构传统房地产经纪的信息垄断与服务模式。房源信息更加透明、客户自主获取信息能力显著增强，对传统中介”信息差”盈利模式形成巨大挑战。与此同时，技术变革也为独立、专业的第三方服务机构提供了新的获客通道与服务工具，降低了新进入者的品牌传播成本，使公司有机会以”专业内容+国企信用”切入市场，实现弯道超车。</w:t>
+      </w:r>
+    </w:p>
+    <w:p>
+      <w:pPr>
+        <w:pStyle w:val="23"/>
+        <w:spacing w:before="0" w:after="0" w:line="560" w:lineRule="exact"/>
+        <w:ind w:left="0" w:firstLine="640" w:firstLineChars="200"/>
+        <w:jc w:val="both"/>
+        <w:rPr>
+          <w:rFonts w:hint="eastAsia" w:ascii="仿宋" w:hAnsi="仿宋" w:eastAsia="仿宋" w:cs="仿宋"/>
+          <w:b w:val="0"/>
+          <w:color w:val="000000"/>
+          <w:sz w:val="32"/>
+        </w:rPr>
+      </w:pPr>
+      <w:r>
+        <w:rPr>
+          <w:rFonts w:hint="eastAsia" w:ascii="仿宋" w:hAnsi="仿宋" w:eastAsia="仿宋" w:cs="仿宋"/>
+          <w:b w:val="0"/>
+          <w:color w:val="000000"/>
+          <w:sz w:val="32"/>
+        </w:rPr>
+        <w:t>在此段后新增：</w:t>
+      </w:r>
+    </w:p>
+    <w:p>
+      <w:pPr>
+        <w:pStyle w:val="13"/>
+        <w:spacing w:before="0" w:after="0" w:line="560" w:lineRule="exact"/>
+        <w:ind w:left="0" w:firstLine="640" w:firstLineChars="200"/>
+        <w:jc w:val="both"/>
+        <w:rPr>
+          <w:rFonts w:hint="eastAsia" w:ascii="仿宋" w:hAnsi="仿宋" w:eastAsia="仿宋" w:cs="仿宋"/>
+          <w:b w:val="0"/>
+          <w:color w:val="000000"/>
+          <w:sz w:val="32"/>
+        </w:rPr>
+      </w:pPr>
+      <w:r>
+        <w:rPr>
+          <w:rFonts w:hint="eastAsia" w:ascii="仿宋" w:hAnsi="仿宋" w:eastAsia="仿宋" w:cs="仿宋"/>
+          <w:b w:val="0"/>
+          <w:color w:val="000000"/>
+          <w:sz w:val="32"/>
+        </w:rPr>
+        <w:t>尤为值得关注的是，AI智能体（Agent）的快速崛起正在重塑未来的商业逻辑——用户获取服务的入口可能从”搜索式、浏览式”转向”对话式、委托式”，即从”人找服务”演变为”AI代人找服务”。这意味着，未来的流量分配机制可能从传统的平台搜索排名，转向AI智能体对服务提供方的智能匹配与推荐。谁能让自己的服务数据被大模型理解、被AI智能体调用，谁就能在新的流量格局中占据先机。因此，公司在平台建设初期即需建立”AI原生”意识，在技术架构和数据治理层面为”被AI调用”提前做好储备，这不仅是技术选型问题，更是关乎未来三到五年流量入口话语权的战略判断。</w:t>
+      </w:r>
+    </w:p>
+    <w:p>
+      <w:pPr>
+        <w:pStyle w:val="23"/>
+        <w:spacing w:before="0" w:after="0" w:line="560" w:lineRule="exact"/>
+        <w:ind w:left="0" w:firstLine="640" w:firstLineChars="200"/>
+        <w:jc w:val="both"/>
+        <w:rPr>
+          <w:rFonts w:hint="eastAsia" w:ascii="仿宋" w:hAnsi="仿宋" w:eastAsia="仿宋" w:cs="仿宋"/>
+          <w:b w:val="0"/>
+          <w:color w:val="000000"/>
+          <w:sz w:val="32"/>
+        </w:rPr>
+      </w:pPr>
+      <w:r>
+        <w:rPr>
+          <w:rFonts w:hint="eastAsia" w:ascii="仿宋" w:hAnsi="仿宋" w:eastAsia="仿宋" w:cs="仿宋"/>
+          <w:b w:val="0"/>
+          <w:color w:val="000000"/>
+          <w:sz w:val="32"/>
+        </w:rPr>
+        <w:t>原因：</w:t>
       </w:r>
     </w:p>
     <w:p>
@@ -2801,173 +2971,37 @@
           <w:color w:val="000000"/>
           <w:sz w:val="32"/>
         </w:rPr>
-        <w:t>（一）修改点一</w:t>
-      </w:r>
-    </w:p>
-    <w:p>
-      <w:pPr>
-        <w:pStyle w:val="3"/>
-        <w:spacing w:before="0" w:after="0" w:line="560" w:lineRule="exact"/>
-        <w:ind w:left="0" w:firstLine="640" w:firstLineChars="200"/>
-        <w:jc w:val="both"/>
-        <w:rPr>
-          <w:rFonts w:hint="eastAsia" w:ascii="仿宋" w:hAnsi="仿宋" w:eastAsia="仿宋" w:cs="仿宋"/>
-          <w:b w:val="0"/>
-          <w:color w:val="000000"/>
-          <w:sz w:val="32"/>
-        </w:rPr>
-      </w:pPr>
-      <w:r>
-        <w:rPr>
-          <w:rFonts w:hint="eastAsia" w:ascii="仿宋" w:hAnsi="仿宋" w:eastAsia="仿宋" w:cs="仿宋"/>
-          <w:b w:val="0"/>
-          <w:color w:val="000000"/>
-          <w:sz w:val="32"/>
-        </w:rPr>
-        <w:t>原文（第二章·外部环境研判·技术环境）：</w:t>
-      </w:r>
-    </w:p>
-    <w:p>
-      <w:pPr>
-        <w:pStyle w:val="13"/>
-        <w:spacing w:before="0" w:after="0" w:line="560" w:lineRule="exact"/>
-        <w:ind w:left="0" w:firstLine="640" w:firstLineChars="200"/>
-        <w:jc w:val="both"/>
-        <w:rPr>
-          <w:rFonts w:hint="eastAsia" w:ascii="仿宋" w:hAnsi="仿宋" w:eastAsia="仿宋" w:cs="仿宋"/>
-          <w:b w:val="0"/>
-          <w:color w:val="000000"/>
-          <w:sz w:val="32"/>
-        </w:rPr>
-      </w:pPr>
-      <w:r>
-        <w:rPr>
-          <w:rFonts w:hint="eastAsia" w:ascii="仿宋" w:hAnsi="仿宋" w:eastAsia="仿宋" w:cs="仿宋"/>
-          <w:b w:val="0"/>
-          <w:color w:val="000000"/>
-          <w:sz w:val="32"/>
-        </w:rPr>
-        <w:t>自媒体平台的去中心化传播与AI技术的深度应用，正在解构传统房地产经纪的信息垄断与服务模式。房源信息更加透明、客户自主获取信息能力显著增强，对传统中介”信息差”盈利模式形成巨大挑战。与此同时，技术变革也为独立、专业的第三方服务机构提供了新的获客通道与服务工具，降低了新进入者的品牌传播成本，使公司有机会以”专业内容+国企信用”切入市场，实现弯道超车。</w:t>
+        <w:t>规划原文仅将AI视为”工具”和”传播渠道”，视角偏窄。实际上，AI智能体正在从底层重构用户获取服务的逻辑——未来用户可能不再”逛”平台，而是直接告诉AI助手需求，由AI代为筛选和推荐。这意味着流量入口可能从APP/小程序转移到AI智能体。新增段落将AI的讨论从”工具应用”提升到”商业模式重构”的战略高度，为后续”AI就绪”建议建立逻辑基础。</w:t>
+      </w:r>
+    </w:p>
+    <w:bookmarkEnd w:id="14"/>
+    <w:p>
+      <w:pPr>
+        <w:pStyle w:val="5"/>
+        <w:spacing w:before="0" w:after="0" w:line="560" w:lineRule="exact"/>
+        <w:ind w:left="0" w:firstLine="643" w:firstLineChars="200"/>
+        <w:jc w:val="both"/>
+        <w:rPr>
+          <w:rFonts w:hint="eastAsia" w:ascii="楷体" w:hAnsi="楷体" w:eastAsia="楷体" w:cs="楷体"/>
+          <w:b/>
+          <w:color w:val="000000"/>
+          <w:sz w:val="32"/>
+        </w:rPr>
+      </w:pPr>
+      <w:bookmarkStart w:id="15" w:name="二修改点二"/>
+      <w:r>
+        <w:rPr>
+          <w:rFonts w:hint="eastAsia" w:ascii="楷体" w:hAnsi="楷体" w:eastAsia="楷体" w:cs="楷体"/>
+          <w:b/>
+          <w:color w:val="000000"/>
+          <w:sz w:val="32"/>
+        </w:rPr>
+        <w:t>（二）修改点二</w:t>
       </w:r>
     </w:p>
     <w:p>
       <w:pPr>
         <w:pStyle w:val="23"/>
-        <w:spacing w:before="0" w:after="0" w:line="560" w:lineRule="exact"/>
-        <w:ind w:left="0" w:firstLine="640" w:firstLineChars="200"/>
-        <w:jc w:val="both"/>
-        <w:rPr>
-          <w:rFonts w:hint="eastAsia" w:ascii="仿宋" w:hAnsi="仿宋" w:eastAsia="仿宋" w:cs="仿宋"/>
-          <w:b w:val="0"/>
-          <w:color w:val="000000"/>
-          <w:sz w:val="32"/>
-        </w:rPr>
-      </w:pPr>
-      <w:r>
-        <w:rPr>
-          <w:rFonts w:hint="eastAsia" w:ascii="仿宋" w:hAnsi="仿宋" w:eastAsia="仿宋" w:cs="仿宋"/>
-          <w:b w:val="0"/>
-          <w:color w:val="000000"/>
-          <w:sz w:val="32"/>
-        </w:rPr>
-        <w:t>在此段后新增：</w:t>
-      </w:r>
-    </w:p>
-    <w:p>
-      <w:pPr>
-        <w:pStyle w:val="13"/>
-        <w:spacing w:before="0" w:after="0" w:line="560" w:lineRule="exact"/>
-        <w:ind w:left="0" w:firstLine="640" w:firstLineChars="200"/>
-        <w:jc w:val="both"/>
-        <w:rPr>
-          <w:rFonts w:hint="eastAsia" w:ascii="仿宋" w:hAnsi="仿宋" w:eastAsia="仿宋" w:cs="仿宋"/>
-          <w:b w:val="0"/>
-          <w:color w:val="000000"/>
-          <w:sz w:val="32"/>
-        </w:rPr>
-      </w:pPr>
-      <w:r>
-        <w:rPr>
-          <w:rFonts w:hint="eastAsia" w:ascii="仿宋" w:hAnsi="仿宋" w:eastAsia="仿宋" w:cs="仿宋"/>
-          <w:b w:val="0"/>
-          <w:color w:val="000000"/>
-          <w:sz w:val="32"/>
-        </w:rPr>
-        <w:t>尤为值得关注的是，AI智能体（Agent）的快速崛起正在重塑未来的商业逻辑——用户获取服务的入口可能从”搜索式、浏览式”转向”对话式、委托式”，即从”人找服务”演变为”AI代人找服务”。这意味着，未来的流量分配机制可能从传统的平台搜索排名，转向AI智能体对服务提供方的智能匹配与推荐。谁能让自己的服务数据被大模型理解、被AI智能体调用，谁就能在新的流量格局中占据先机。因此，公司在平台建设初期即需建立”AI原生”意识，在技术架构和数据治理层面为”被AI调用”提前做好储备，这不仅是技术选型问题，更是关乎未来三到五年流量入口话语权的战略判断。</w:t>
-      </w:r>
-    </w:p>
-    <w:p>
-      <w:pPr>
-        <w:pStyle w:val="23"/>
-        <w:spacing w:before="0" w:after="0" w:line="560" w:lineRule="exact"/>
-        <w:ind w:left="0" w:firstLine="640" w:firstLineChars="200"/>
-        <w:jc w:val="both"/>
-        <w:rPr>
-          <w:rFonts w:hint="eastAsia" w:ascii="仿宋" w:hAnsi="仿宋" w:eastAsia="仿宋" w:cs="仿宋"/>
-          <w:b w:val="0"/>
-          <w:color w:val="000000"/>
-          <w:sz w:val="32"/>
-        </w:rPr>
-      </w:pPr>
-      <w:r>
-        <w:rPr>
-          <w:rFonts w:hint="eastAsia" w:ascii="仿宋" w:hAnsi="仿宋" w:eastAsia="仿宋" w:cs="仿宋"/>
-          <w:b w:val="0"/>
-          <w:color w:val="000000"/>
-          <w:sz w:val="32"/>
-        </w:rPr>
-        <w:t>原因：</w:t>
-      </w:r>
-    </w:p>
-    <w:p>
-      <w:pPr>
-        <w:pStyle w:val="3"/>
-        <w:spacing w:before="0" w:after="0" w:line="560" w:lineRule="exact"/>
-        <w:ind w:left="0" w:firstLine="640" w:firstLineChars="200"/>
-        <w:jc w:val="both"/>
-        <w:rPr>
-          <w:rFonts w:hint="eastAsia" w:ascii="仿宋" w:hAnsi="仿宋" w:eastAsia="仿宋" w:cs="仿宋"/>
-          <w:b w:val="0"/>
-          <w:color w:val="000000"/>
-          <w:sz w:val="32"/>
-        </w:rPr>
-      </w:pPr>
-      <w:r>
-        <w:rPr>
-          <w:rFonts w:hint="eastAsia" w:ascii="仿宋" w:hAnsi="仿宋" w:eastAsia="仿宋" w:cs="仿宋"/>
-          <w:b w:val="0"/>
-          <w:color w:val="000000"/>
-          <w:sz w:val="32"/>
-        </w:rPr>
-        <w:t>规划原文仅将AI视为”工具”和”传播渠道”，视角偏窄。实际上，AI智能体正在从底层重构用户获取服务的逻辑——未来用户可能不再”逛”平台，而是直接告诉AI助手需求，由AI代为筛选和推荐。这意味着流量入口可能从APP/小程序转移到AI智能体。新增段落将AI的讨论从”工具应用”提升到”商业模式重构”的战略高度，为后续”AI就绪”建议建立逻辑基础。</w:t>
-      </w:r>
-    </w:p>
-    <w:p>
-      <w:pPr>
-        <w:pStyle w:val="3"/>
-        <w:spacing w:before="0" w:after="0" w:line="560" w:lineRule="exact"/>
-        <w:ind w:left="0" w:firstLine="640" w:firstLineChars="200"/>
-        <w:jc w:val="both"/>
-        <w:rPr>
-          <w:rFonts w:hint="eastAsia" w:ascii="仿宋" w:hAnsi="仿宋" w:eastAsia="仿宋" w:cs="仿宋"/>
-          <w:b w:val="0"/>
-          <w:color w:val="000000"/>
-          <w:sz w:val="32"/>
-        </w:rPr>
-      </w:pPr>
-      <w:r>
-        <w:rPr>
-          <w:rFonts w:hint="eastAsia" w:ascii="仿宋" w:hAnsi="仿宋" w:eastAsia="仿宋" w:cs="仿宋"/>
-          <w:b w:val="0"/>
-          <w:color w:val="000000"/>
-          <w:sz w:val="32"/>
-        </w:rPr>
-        <w:t>（二）修改点二</w:t>
-      </w:r>
-    </w:p>
-    <w:p>
-      <w:pPr>
-        <w:pStyle w:val="3"/>
         <w:spacing w:before="0" w:after="0" w:line="560" w:lineRule="exact"/>
         <w:ind w:left="0" w:firstLine="640" w:firstLineChars="200"/>
         <w:jc w:val="both"/>
@@ -3130,6 +3164,146 @@
         <w:t>原有五项原则中缺少对AI趋势的前瞻性考量。平台的技术底座一旦确定，后续改造的难度和成本极高——如果现在不提要求，等平台建好再想”被AI调用”，就不是”加个接口”那么简单，而是涉及数据重构、接口重写、架构调整的大工程。新增此项原则，将”AI就绪”纳入平台建设的底层规范，不增加工作量，但为未来打开可能性。</w:t>
       </w:r>
     </w:p>
+    <w:bookmarkEnd w:id="15"/>
+    <w:p>
+      <w:pPr>
+        <w:pStyle w:val="5"/>
+        <w:spacing w:before="0" w:after="0" w:line="560" w:lineRule="exact"/>
+        <w:ind w:left="0" w:firstLine="643" w:firstLineChars="200"/>
+        <w:jc w:val="both"/>
+        <w:rPr>
+          <w:rFonts w:hint="eastAsia" w:ascii="楷体" w:hAnsi="楷体" w:eastAsia="楷体" w:cs="楷体"/>
+          <w:b/>
+          <w:color w:val="000000"/>
+          <w:sz w:val="32"/>
+        </w:rPr>
+      </w:pPr>
+      <w:bookmarkStart w:id="16" w:name="三修改点三"/>
+      <w:r>
+        <w:rPr>
+          <w:rFonts w:hint="eastAsia" w:ascii="楷体" w:hAnsi="楷体" w:eastAsia="楷体" w:cs="楷体"/>
+          <w:b/>
+          <w:color w:val="000000"/>
+          <w:sz w:val="32"/>
+        </w:rPr>
+        <w:t>（三）修改点三</w:t>
+      </w:r>
+    </w:p>
+    <w:p>
+      <w:pPr>
+        <w:pStyle w:val="23"/>
+        <w:spacing w:before="0" w:after="0" w:line="560" w:lineRule="exact"/>
+        <w:ind w:left="0" w:firstLine="640" w:firstLineChars="200"/>
+        <w:jc w:val="both"/>
+        <w:rPr>
+          <w:rFonts w:hint="eastAsia" w:ascii="仿宋" w:hAnsi="仿宋" w:eastAsia="仿宋" w:cs="仿宋"/>
+          <w:b w:val="0"/>
+          <w:color w:val="000000"/>
+          <w:sz w:val="32"/>
+        </w:rPr>
+      </w:pPr>
+      <w:r>
+        <w:rPr>
+          <w:rFonts w:hint="eastAsia" w:ascii="仿宋" w:hAnsi="仿宋" w:eastAsia="仿宋" w:cs="仿宋"/>
+          <w:b w:val="0"/>
+          <w:color w:val="000000"/>
+          <w:sz w:val="32"/>
+        </w:rPr>
+        <w:t>原文（第六章·第四年—第五年（2029—2030年）·内部管理）：</w:t>
+      </w:r>
+    </w:p>
+    <w:p>
+      <w:pPr>
+        <w:pStyle w:val="13"/>
+        <w:spacing w:before="0" w:after="0" w:line="560" w:lineRule="exact"/>
+        <w:ind w:left="0" w:firstLine="640" w:firstLineChars="200"/>
+        <w:jc w:val="both"/>
+        <w:rPr>
+          <w:rFonts w:hint="eastAsia" w:ascii="仿宋" w:hAnsi="仿宋" w:eastAsia="仿宋" w:cs="仿宋"/>
+          <w:b w:val="0"/>
+          <w:color w:val="000000"/>
+          <w:sz w:val="32"/>
+        </w:rPr>
+      </w:pPr>
+      <w:r>
+        <w:rPr>
+          <w:rFonts w:hint="eastAsia" w:ascii="仿宋" w:hAnsi="仿宋" w:eastAsia="仿宋" w:cs="仿宋"/>
+          <w:b w:val="0"/>
+          <w:color w:val="000000"/>
+          <w:sz w:val="32"/>
+        </w:rPr>
+        <w:t>探索AI辅助决策在风控、营销等领域的深度应用。</w:t>
+      </w:r>
+    </w:p>
+    <w:p>
+      <w:pPr>
+        <w:pStyle w:val="23"/>
+        <w:spacing w:before="0" w:after="0" w:line="560" w:lineRule="exact"/>
+        <w:ind w:left="0" w:firstLine="640" w:firstLineChars="200"/>
+        <w:jc w:val="both"/>
+        <w:rPr>
+          <w:rFonts w:hint="eastAsia" w:ascii="仿宋" w:hAnsi="仿宋" w:eastAsia="仿宋" w:cs="仿宋"/>
+          <w:b w:val="0"/>
+          <w:color w:val="000000"/>
+          <w:sz w:val="32"/>
+        </w:rPr>
+      </w:pPr>
+      <w:r>
+        <w:rPr>
+          <w:rFonts w:hint="eastAsia" w:ascii="仿宋" w:hAnsi="仿宋" w:eastAsia="仿宋" w:cs="仿宋"/>
+          <w:b w:val="0"/>
+          <w:color w:val="000000"/>
+          <w:sz w:val="32"/>
+        </w:rPr>
+        <w:t>在原文后新增：</w:t>
+      </w:r>
+    </w:p>
+    <w:p>
+      <w:pPr>
+        <w:pStyle w:val="13"/>
+        <w:spacing w:before="0" w:after="0" w:line="560" w:lineRule="exact"/>
+        <w:ind w:left="0" w:firstLine="640" w:firstLineChars="200"/>
+        <w:jc w:val="both"/>
+        <w:rPr>
+          <w:rFonts w:hint="eastAsia" w:ascii="仿宋" w:hAnsi="仿宋" w:eastAsia="仿宋" w:cs="仿宋"/>
+          <w:b w:val="0"/>
+          <w:color w:val="000000"/>
+          <w:sz w:val="32"/>
+        </w:rPr>
+      </w:pPr>
+      <w:r>
+        <w:rPr>
+          <w:rFonts w:hint="eastAsia" w:ascii="仿宋" w:hAnsi="仿宋" w:eastAsia="仿宋" w:cs="仿宋"/>
+          <w:b w:val="0"/>
+          <w:color w:val="000000"/>
+          <w:sz w:val="32"/>
+        </w:rPr>
+        <w:t>同时，在平台生态层面，开放标准化API接口，探索与主流AI智能体平台的对接与合作，使公司的不动产服务能力能够被大模型调用和推荐，在AI驱动的流量新格局中建立先发布局。</w:t>
+      </w:r>
+    </w:p>
+    <w:p>
+      <w:pPr>
+        <w:pStyle w:val="23"/>
+        <w:spacing w:before="0" w:after="0" w:line="560" w:lineRule="exact"/>
+        <w:ind w:left="0" w:firstLine="640" w:firstLineChars="200"/>
+        <w:jc w:val="both"/>
+        <w:rPr>
+          <w:rFonts w:hint="eastAsia" w:ascii="仿宋" w:hAnsi="仿宋" w:eastAsia="仿宋" w:cs="仿宋"/>
+          <w:b w:val="0"/>
+          <w:color w:val="000000"/>
+          <w:sz w:val="32"/>
+        </w:rPr>
+      </w:pPr>
+      <w:r>
+        <w:rPr>
+          <w:rFonts w:hint="eastAsia" w:ascii="仿宋" w:hAnsi="仿宋" w:eastAsia="仿宋" w:cs="仿宋"/>
+          <w:b w:val="0"/>
+          <w:color w:val="000000"/>
+          <w:sz w:val="32"/>
+        </w:rPr>
+        <w:t>原因：</w:t>
+      </w:r>
+    </w:p>
     <w:p>
       <w:pPr>
         <w:pStyle w:val="3"/>
@@ -3150,53 +3324,33 @@
           <w:color w:val="000000"/>
           <w:sz w:val="32"/>
         </w:rPr>
-        <w:t>（三）修改点三</w:t>
-      </w:r>
-    </w:p>
-    <w:p>
-      <w:pPr>
-        <w:pStyle w:val="3"/>
-        <w:spacing w:before="0" w:after="0" w:line="560" w:lineRule="exact"/>
-        <w:ind w:left="0" w:firstLine="640" w:firstLineChars="200"/>
-        <w:jc w:val="both"/>
-        <w:rPr>
-          <w:rFonts w:hint="eastAsia" w:ascii="仿宋" w:hAnsi="仿宋" w:eastAsia="仿宋" w:cs="仿宋"/>
-          <w:b w:val="0"/>
-          <w:color w:val="000000"/>
-          <w:sz w:val="32"/>
-        </w:rPr>
-      </w:pPr>
-      <w:r>
-        <w:rPr>
-          <w:rFonts w:hint="eastAsia" w:ascii="仿宋" w:hAnsi="仿宋" w:eastAsia="仿宋" w:cs="仿宋"/>
-          <w:b w:val="0"/>
-          <w:color w:val="000000"/>
-          <w:sz w:val="32"/>
-        </w:rPr>
-        <w:t>原文（第六章·第四年—第五年（2029—2030年）·内部管理）：</w:t>
-      </w:r>
-    </w:p>
-    <w:p>
-      <w:pPr>
-        <w:pStyle w:val="13"/>
-        <w:spacing w:before="0" w:after="0" w:line="560" w:lineRule="exact"/>
-        <w:ind w:left="0" w:firstLine="640" w:firstLineChars="200"/>
-        <w:jc w:val="both"/>
-        <w:rPr>
-          <w:rFonts w:hint="eastAsia" w:ascii="仿宋" w:hAnsi="仿宋" w:eastAsia="仿宋" w:cs="仿宋"/>
-          <w:b w:val="0"/>
-          <w:color w:val="000000"/>
-          <w:sz w:val="32"/>
-        </w:rPr>
-      </w:pPr>
-      <w:r>
-        <w:rPr>
-          <w:rFonts w:hint="eastAsia" w:ascii="仿宋" w:hAnsi="仿宋" w:eastAsia="仿宋" w:cs="仿宋"/>
-          <w:b w:val="0"/>
-          <w:color w:val="000000"/>
-          <w:sz w:val="32"/>
-        </w:rPr>
-        <w:t>探索AI辅助决策在风控、营销等领域的深度应用。</w:t>
+        <w:t>原文仅将AI定位为内部管理工具，视角偏窄。AI不仅是”我如何用AI提效”的问题，更是”AI如何帮我带客户”的问题——后者的战略价值远大于前者。新增内容将AI从”内部工具”扩展到”生态连接器”，体现”AI原生”平台的另一层含义：既用AI提升内部效率，更通过AI生态获取外部流量。</w:t>
+      </w:r>
+    </w:p>
+    <w:bookmarkEnd w:id="13"/>
+    <w:bookmarkEnd w:id="16"/>
+    <w:p>
+      <w:pPr>
+        <w:pStyle w:val="4"/>
+        <w:spacing w:before="0" w:after="720" w:line="560" w:lineRule="exact"/>
+        <w:ind w:left="0" w:firstLine="0" w:firstLineChars="0"/>
+        <w:jc w:val="left"/>
+        <w:rPr>
+          <w:rFonts w:hint="eastAsia" w:ascii="黑体" w:hAnsi="黑体" w:eastAsia="黑体" w:cs="黑体"/>
+          <w:b w:val="0"/>
+          <w:color w:val="000000"/>
+          <w:sz w:val="32"/>
+        </w:rPr>
+      </w:pPr>
+      <w:bookmarkStart w:id="17" w:name="五关于数据要素价值的深度挖掘进一步明确"/>
+      <w:r>
+        <w:rPr>
+          <w:rFonts w:hint="eastAsia" w:ascii="黑体" w:hAnsi="黑体" w:eastAsia="黑体" w:cs="黑体"/>
+          <w:b w:val="0"/>
+          <w:color w:val="000000"/>
+          <w:sz w:val="32"/>
+        </w:rPr>
+        <w:t>五、　关于数据要素价值的”深度挖掘”进一步明确</w:t>
       </w:r>
     </w:p>
     <w:p>
@@ -3219,150 +3373,36 @@
           <w:color w:val="000000"/>
           <w:sz w:val="32"/>
         </w:rPr>
-        <w:t>在原文后新增：</w:t>
-      </w:r>
-    </w:p>
-    <w:p>
-      <w:pPr>
-        <w:pStyle w:val="13"/>
-        <w:spacing w:before="0" w:after="0" w:line="560" w:lineRule="exact"/>
-        <w:ind w:left="0" w:firstLine="640" w:firstLineChars="200"/>
-        <w:jc w:val="both"/>
-        <w:rPr>
-          <w:rFonts w:hint="eastAsia" w:ascii="仿宋" w:hAnsi="仿宋" w:eastAsia="仿宋" w:cs="仿宋"/>
-          <w:b w:val="0"/>
-          <w:color w:val="000000"/>
-          <w:sz w:val="32"/>
-        </w:rPr>
-      </w:pPr>
-      <w:r>
-        <w:rPr>
-          <w:rFonts w:hint="eastAsia" w:ascii="仿宋" w:hAnsi="仿宋" w:eastAsia="仿宋" w:cs="仿宋"/>
-          <w:b w:val="0"/>
-          <w:color w:val="000000"/>
-          <w:sz w:val="32"/>
-        </w:rPr>
-        <w:t>同时，在平台生态层面，开放标准化API接口，探索与主流AI智能体平台的对接与合作，使公司的不动产服务能力能够被大模型调用和推荐，在AI驱动的流量新格局中建立先发布局。</w:t>
+        <w:t>规划提到”数据驱动”，结合”十五五”规划对数据要素价值释放的要求，建议可以补充以下内容：</w:t>
+      </w:r>
+    </w:p>
+    <w:p>
+      <w:pPr>
+        <w:pStyle w:val="5"/>
+        <w:spacing w:before="0" w:after="0" w:line="560" w:lineRule="exact"/>
+        <w:ind w:left="0" w:firstLine="643" w:firstLineChars="200"/>
+        <w:jc w:val="both"/>
+        <w:rPr>
+          <w:rFonts w:hint="eastAsia" w:ascii="楷体" w:hAnsi="楷体" w:eastAsia="楷体" w:cs="楷体"/>
+          <w:b/>
+          <w:color w:val="000000"/>
+          <w:sz w:val="32"/>
+        </w:rPr>
+      </w:pPr>
+      <w:bookmarkStart w:id="18" w:name="四前瞻布局数据要素价值释放"/>
+      <w:r>
+        <w:rPr>
+          <w:rFonts w:hint="eastAsia" w:ascii="楷体" w:hAnsi="楷体" w:eastAsia="楷体" w:cs="楷体"/>
+          <w:b/>
+          <w:color w:val="000000"/>
+          <w:sz w:val="32"/>
+        </w:rPr>
+        <w:t>（四）前瞻布局数据要素价值释放</w:t>
       </w:r>
     </w:p>
     <w:p>
       <w:pPr>
         <w:pStyle w:val="23"/>
-        <w:spacing w:before="0" w:after="0" w:line="560" w:lineRule="exact"/>
-        <w:ind w:left="0" w:firstLine="640" w:firstLineChars="200"/>
-        <w:jc w:val="both"/>
-        <w:rPr>
-          <w:rFonts w:hint="eastAsia" w:ascii="仿宋" w:hAnsi="仿宋" w:eastAsia="仿宋" w:cs="仿宋"/>
-          <w:b w:val="0"/>
-          <w:color w:val="000000"/>
-          <w:sz w:val="32"/>
-        </w:rPr>
-      </w:pPr>
-      <w:r>
-        <w:rPr>
-          <w:rFonts w:hint="eastAsia" w:ascii="仿宋" w:hAnsi="仿宋" w:eastAsia="仿宋" w:cs="仿宋"/>
-          <w:b w:val="0"/>
-          <w:color w:val="000000"/>
-          <w:sz w:val="32"/>
-        </w:rPr>
-        <w:t>原因：</w:t>
-      </w:r>
-    </w:p>
-    <w:p>
-      <w:pPr>
-        <w:pStyle w:val="3"/>
-        <w:spacing w:before="0" w:after="0" w:line="560" w:lineRule="exact"/>
-        <w:ind w:left="0" w:firstLine="640" w:firstLineChars="200"/>
-        <w:jc w:val="both"/>
-        <w:rPr>
-          <w:rFonts w:hint="eastAsia" w:ascii="仿宋" w:hAnsi="仿宋" w:eastAsia="仿宋" w:cs="仿宋"/>
-          <w:b w:val="0"/>
-          <w:color w:val="000000"/>
-          <w:sz w:val="32"/>
-        </w:rPr>
-      </w:pPr>
-      <w:r>
-        <w:rPr>
-          <w:rFonts w:hint="eastAsia" w:ascii="仿宋" w:hAnsi="仿宋" w:eastAsia="仿宋" w:cs="仿宋"/>
-          <w:b w:val="0"/>
-          <w:color w:val="000000"/>
-          <w:sz w:val="32"/>
-        </w:rPr>
-        <w:t>原文仅将AI定位为内部管理工具，视角偏窄。AI不仅是”我如何用AI提效”的问题，更是”AI如何帮我带客户”的问题——后者的战略价值远大于前者。新增内容将AI从”内部工具”扩展到”生态连接器”，体现”AI原生”平台的另一层含义：既用AI提升内部效率，更通过AI生态获取外部流量。</w:t>
-      </w:r>
-    </w:p>
-    <w:p>
-      <w:pPr>
-        <w:pStyle w:val="3"/>
-        <w:spacing w:before="0" w:after="0" w:line="560" w:lineRule="exact"/>
-        <w:ind w:left="0" w:firstLine="640" w:firstLineChars="200"/>
-        <w:jc w:val="both"/>
-        <w:rPr>
-          <w:rFonts w:hint="eastAsia" w:ascii="黑体" w:hAnsi="黑体" w:eastAsia="黑体" w:cs="黑体"/>
-          <w:b w:val="0"/>
-          <w:color w:val="000000"/>
-          <w:sz w:val="32"/>
-        </w:rPr>
-      </w:pPr>
-      <w:r>
-        <w:rPr>
-          <w:rFonts w:hint="eastAsia" w:ascii="黑体" w:hAnsi="黑体" w:eastAsia="黑体" w:cs="黑体"/>
-          <w:b w:val="0"/>
-          <w:color w:val="000000"/>
-          <w:sz w:val="32"/>
-        </w:rPr>
-        <w:t>五、关于数据要素价值的”深度挖掘”进一步明确</w:t>
-      </w:r>
-    </w:p>
-    <w:p>
-      <w:pPr>
-        <w:pStyle w:val="3"/>
-        <w:spacing w:before="0" w:after="0" w:line="560" w:lineRule="exact"/>
-        <w:ind w:left="0" w:firstLine="640" w:firstLineChars="200"/>
-        <w:jc w:val="both"/>
-        <w:rPr>
-          <w:rFonts w:hint="eastAsia" w:ascii="仿宋" w:hAnsi="仿宋" w:eastAsia="仿宋" w:cs="仿宋"/>
-          <w:b w:val="0"/>
-          <w:color w:val="000000"/>
-          <w:sz w:val="32"/>
-        </w:rPr>
-      </w:pPr>
-      <w:r>
-        <w:rPr>
-          <w:rFonts w:hint="eastAsia" w:ascii="仿宋" w:hAnsi="仿宋" w:eastAsia="仿宋" w:cs="仿宋"/>
-          <w:b w:val="0"/>
-          <w:color w:val="000000"/>
-          <w:sz w:val="32"/>
-        </w:rPr>
-        <w:t>规划提到”数据驱动”，结合”十五五”规划对数据要素价值释放的要求，建议可以补充以下内容：</w:t>
-      </w:r>
-    </w:p>
-    <w:p>
-      <w:pPr>
-        <w:pStyle w:val="3"/>
-        <w:spacing w:before="0" w:after="0" w:line="560" w:lineRule="exact"/>
-        <w:ind w:left="0" w:firstLine="640" w:firstLineChars="200"/>
-        <w:jc w:val="both"/>
-        <w:rPr>
-          <w:rFonts w:hint="eastAsia" w:ascii="仿宋" w:hAnsi="仿宋" w:eastAsia="仿宋" w:cs="仿宋"/>
-          <w:b w:val="0"/>
-          <w:color w:val="000000"/>
-          <w:sz w:val="32"/>
-        </w:rPr>
-      </w:pPr>
-      <w:r>
-        <w:rPr>
-          <w:rFonts w:hint="eastAsia" w:ascii="仿宋" w:hAnsi="仿宋" w:eastAsia="仿宋" w:cs="仿宋"/>
-          <w:b w:val="0"/>
-          <w:color w:val="000000"/>
-          <w:sz w:val="32"/>
-        </w:rPr>
-        <w:t>（四）前瞻布局数据要素价值释放</w:t>
-      </w:r>
-    </w:p>
-    <w:p>
-      <w:pPr>
-        <w:pStyle w:val="3"/>
         <w:spacing w:before="0" w:after="0" w:line="560" w:lineRule="exact"/>
         <w:ind w:left="0" w:firstLine="640" w:firstLineChars="200"/>
         <w:jc w:val="both"/>
@@ -3487,6 +3527,32 @@
         <w:t>2030年（数据资本化探索）：在保障用户隐私与数据安全前提下，将脱敏后的房源、交易、担保数据封装为标准化数据产品，面向银行、评估机构等B端客户输出，开辟新的收入来源。</w:t>
       </w:r>
     </w:p>
+    <w:bookmarkEnd w:id="17"/>
+    <w:bookmarkEnd w:id="18"/>
+    <w:p>
+      <w:pPr>
+        <w:pStyle w:val="4"/>
+        <w:spacing w:before="0" w:after="720" w:line="560" w:lineRule="exact"/>
+        <w:ind w:left="0" w:firstLine="0" w:firstLineChars="0"/>
+        <w:jc w:val="left"/>
+        <w:rPr>
+          <w:rFonts w:hint="eastAsia" w:ascii="黑体" w:hAnsi="黑体" w:eastAsia="黑体" w:cs="黑体"/>
+          <w:b w:val="0"/>
+          <w:color w:val="000000"/>
+          <w:sz w:val="32"/>
+        </w:rPr>
+      </w:pPr>
+      <w:bookmarkStart w:id="19" w:name="六关于增加数字风险防控体系建设"/>
+      <w:r>
+        <w:rPr>
+          <w:rFonts w:hint="eastAsia" w:ascii="黑体" w:hAnsi="黑体" w:eastAsia="黑体" w:cs="黑体"/>
+          <w:b w:val="0"/>
+          <w:color w:val="000000"/>
+          <w:sz w:val="32"/>
+        </w:rPr>
+        <w:t>六、　关于增加数字风险防控体系建设</w:t>
+      </w:r>
+    </w:p>
     <w:p>
       <w:pPr>
         <w:pStyle w:val="23"/>
@@ -3494,20 +3560,20 @@
         <w:ind w:left="0" w:firstLine="640" w:firstLineChars="200"/>
         <w:jc w:val="both"/>
         <w:rPr>
-          <w:rFonts w:hint="eastAsia" w:ascii="黑体" w:hAnsi="黑体" w:eastAsia="黑体" w:cs="黑体"/>
-          <w:b w:val="0"/>
-          <w:color w:val="000000"/>
-          <w:sz w:val="32"/>
-        </w:rPr>
-      </w:pPr>
-      <w:r>
-        <w:rPr>
-          <w:rFonts w:hint="eastAsia" w:ascii="黑体" w:hAnsi="黑体" w:eastAsia="黑体" w:cs="黑体"/>
-          <w:b w:val="0"/>
-          <w:color w:val="000000"/>
-          <w:sz w:val="32"/>
-        </w:rPr>
-        <w:t>六、关于增加数字风险防控体系建设</w:t>
+          <w:rFonts w:hint="eastAsia" w:ascii="仿宋" w:hAnsi="仿宋" w:eastAsia="仿宋" w:cs="仿宋"/>
+          <w:b w:val="0"/>
+          <w:color w:val="000000"/>
+          <w:sz w:val="32"/>
+        </w:rPr>
+      </w:pPr>
+      <w:r>
+        <w:rPr>
+          <w:rFonts w:hint="eastAsia" w:ascii="仿宋" w:hAnsi="仿宋" w:eastAsia="仿宋" w:cs="仿宋"/>
+          <w:b w:val="0"/>
+          <w:color w:val="000000"/>
+          <w:sz w:val="32"/>
+        </w:rPr>
+        <w:t>依据《银行业保险业数字金融高质量发展实施方案》。《方案》要求，着力建设智能风控体系，重点强化数字化形势下的战略风险、合规风险、操作风险、外包风险、流动性风险等重点风险防控，加强数据安全和网络安全防护，提升人工智能技术的安全应用能力，有效管理算法模型风险，防范数字生态外部合作风险。</w:t>
       </w:r>
     </w:p>
     <w:p>
@@ -3530,29 +3596,6 @@
           <w:color w:val="000000"/>
           <w:sz w:val="32"/>
         </w:rPr>
-        <w:t>依据《银行业保险业数字金融高质量发展实施方案》。《方案》要求，着力建设智能风控体系，重点强化数字化形势下的战略风险、合规风险、操作风险、外包风险、流动性风险等重点风险防控，加强数据安全和网络安全防护，提升人工智能技术的安全应用能力，有效管理算法模型风险，防范数字生态外部合作风险。</w:t>
-      </w:r>
-    </w:p>
-    <w:p>
-      <w:pPr>
-        <w:pStyle w:val="3"/>
-        <w:spacing w:before="0" w:after="0" w:line="560" w:lineRule="exact"/>
-        <w:ind w:left="0" w:firstLine="640" w:firstLineChars="200"/>
-        <w:jc w:val="both"/>
-        <w:rPr>
-          <w:rFonts w:hint="eastAsia" w:ascii="仿宋" w:hAnsi="仿宋" w:eastAsia="仿宋" w:cs="仿宋"/>
-          <w:b w:val="0"/>
-          <w:color w:val="000000"/>
-          <w:sz w:val="32"/>
-        </w:rPr>
-      </w:pPr>
-      <w:r>
-        <w:rPr>
-          <w:rFonts w:hint="eastAsia" w:ascii="仿宋" w:hAnsi="仿宋" w:eastAsia="仿宋" w:cs="仿宋"/>
-          <w:b w:val="0"/>
-          <w:color w:val="000000"/>
-          <w:sz w:val="32"/>
-        </w:rPr>
         <w:t>建议：在第三节五个子项之后、预期成果之前，新增一个子项（五），原”（五）制度系统化”顺延为”（六）“，内容如下：</w:t>
       </w:r>
     </w:p>
@@ -3560,19 +3603,19 @@
       <w:pPr>
         <w:pStyle w:val="13"/>
         <w:spacing w:before="0" w:after="0" w:line="560" w:lineRule="exact"/>
-        <w:ind w:left="0" w:firstLine="640" w:firstLineChars="200"/>
-        <w:jc w:val="both"/>
-        <w:rPr>
-          <w:rFonts w:hint="eastAsia" w:ascii="仿宋" w:hAnsi="仿宋" w:eastAsia="仿宋" w:cs="仿宋"/>
-          <w:b w:val="0"/>
-          <w:color w:val="000000"/>
-          <w:sz w:val="32"/>
-        </w:rPr>
-      </w:pPr>
-      <w:r>
-        <w:rPr>
-          <w:rFonts w:hint="eastAsia" w:ascii="仿宋" w:hAnsi="仿宋" w:eastAsia="仿宋" w:cs="仿宋"/>
-          <w:b w:val="0"/>
+        <w:ind w:left="0" w:firstLine="643" w:firstLineChars="200"/>
+        <w:jc w:val="both"/>
+        <w:rPr>
+          <w:rFonts w:hint="eastAsia" w:ascii="楷体" w:hAnsi="楷体" w:eastAsia="楷体" w:cs="楷体"/>
+          <w:b/>
+          <w:color w:val="000000"/>
+          <w:sz w:val="32"/>
+        </w:rPr>
+      </w:pPr>
+      <w:r>
+        <w:rPr>
+          <w:rFonts w:hint="eastAsia" w:ascii="楷体" w:hAnsi="楷体" w:eastAsia="楷体" w:cs="楷体"/>
+          <w:b/>
           <w:color w:val="000000"/>
           <w:sz w:val="32"/>
         </w:rPr>
@@ -3603,6 +3646,7 @@
       </w:r>
     </w:p>
     <w:bookmarkEnd w:id="0"/>
+    <w:bookmarkEnd w:id="19"/>
     <w:sectPr>
       <w:footnotePr>
         <w:numRestart w:val="eachSect"/>
@@ -4040,7 +4084,7 @@
     <w:lsdException w:unhideWhenUsed="0" w:uiPriority="0" w:semiHidden="0" w:name="table of figures"/>
     <w:lsdException w:unhideWhenUsed="0" w:uiPriority="0" w:semiHidden="0" w:name="envelope address"/>
     <w:lsdException w:unhideWhenUsed="0" w:uiPriority="0" w:semiHidden="0" w:name="envelope return"/>
-    <w:lsdException w:qFormat="1" w:unhideWhenUsed="0" w:uiPriority="0" w:semiHidden="0" w:name="footnote reference"/>
+    <w:lsdException w:unhideWhenUsed="0" w:uiPriority="0" w:semiHidden="0" w:name="footnote reference"/>
     <w:lsdException w:unhideWhenUsed="0" w:uiPriority="0" w:semiHidden="0" w:name="annotation reference"/>
     <w:lsdException w:unhideWhenUsed="0" w:uiPriority="0" w:semiHidden="0" w:name="line number"/>
     <w:lsdException w:unhideWhenUsed="0" w:uiPriority="0" w:semiHidden="0" w:name="page number"/>
@@ -4087,7 +4131,7 @@
     <w:lsdException w:unhideWhenUsed="0" w:uiPriority="0" w:semiHidden="0" w:name="Body Text Indent 2"/>
     <w:lsdException w:unhideWhenUsed="0" w:uiPriority="0" w:semiHidden="0" w:name="Body Text Indent 3"/>
     <w:lsdException w:qFormat="1" w:uiPriority="9" w:semiHidden="0" w:name="Block Text"/>
-    <w:lsdException w:qFormat="1" w:unhideWhenUsed="0" w:uiPriority="0" w:semiHidden="0" w:name="Hyperlink"/>
+    <w:lsdException w:unhideWhenUsed="0" w:uiPriority="0" w:semiHidden="0" w:name="Hyperlink"/>
     <w:lsdException w:unhideWhenUsed="0" w:uiPriority="0" w:semiHidden="0" w:name="FollowedHyperlink"/>
     <w:lsdException w:unhideWhenUsed="0" w:uiPriority="0" w:semiHidden="0" w:name="Strong"/>
     <w:lsdException w:unhideWhenUsed="0" w:uiPriority="0" w:semiHidden="0" w:name="Emphasis"/>
@@ -4563,7 +4607,6 @@
   <w:style w:type="character" w:styleId="20">
     <w:name w:val="Hyperlink"/>
     <w:basedOn w:val="21"/>
-    <w:qFormat/>
     <w:uiPriority w:val="0"/>
     <w:rPr>
       <w:color w:val="156082" w:themeColor="accent1"/>
@@ -4578,7 +4621,6 @@
   <w:style w:type="character" w:styleId="22">
     <w:name w:val="footnote reference"/>
     <w:basedOn w:val="21"/>
-    <w:qFormat/>
     <w:uiPriority w:val="0"/>
     <w:rPr>
       <w:vertAlign w:val="superscript"/>
@@ -4683,7 +4725,6 @@
     <w:name w:val="Heading 1 Char"/>
     <w:basedOn w:val="19"/>
     <w:link w:val="2"/>
-    <w:qFormat/>
     <w:uiPriority w:val="9"/>
     <w:rPr>
       <w:rFonts w:asciiTheme="majorHAnsi" w:hAnsiTheme="majorHAnsi" w:eastAsiaTheme="majorEastAsia" w:cstheme="majorBidi"/>
@@ -4697,7 +4738,6 @@
     <w:basedOn w:val="19"/>
     <w:link w:val="4"/>
     <w:semiHidden/>
-    <w:qFormat/>
     <w:uiPriority w:val="9"/>
     <w:rPr>
       <w:rFonts w:asciiTheme="majorHAnsi" w:hAnsiTheme="majorHAnsi" w:eastAsiaTheme="majorEastAsia" w:cstheme="majorBidi"/>
@@ -4711,7 +4751,6 @@
     <w:basedOn w:val="19"/>
     <w:link w:val="5"/>
     <w:semiHidden/>
-    <w:qFormat/>
     <w:uiPriority w:val="9"/>
     <w:rPr>
       <w:rFonts w:eastAsiaTheme="majorEastAsia" w:cstheme="majorBidi"/>
@@ -4725,7 +4764,6 @@
     <w:basedOn w:val="19"/>
     <w:link w:val="6"/>
     <w:semiHidden/>
-    <w:qFormat/>
     <w:uiPriority w:val="9"/>
     <w:rPr>
       <w:rFonts w:eastAsiaTheme="majorEastAsia" w:cstheme="majorBidi"/>
@@ -4739,7 +4777,6 @@
     <w:basedOn w:val="19"/>
     <w:link w:val="7"/>
     <w:semiHidden/>
-    <w:qFormat/>
     <w:uiPriority w:val="9"/>
     <w:rPr>
       <w:rFonts w:eastAsiaTheme="majorEastAsia" w:cstheme="majorBidi"/>
@@ -4764,7 +4801,6 @@
     <w:basedOn w:val="19"/>
     <w:link w:val="9"/>
     <w:semiHidden/>
-    <w:qFormat/>
     <w:uiPriority w:val="9"/>
     <w:rPr>
       <w:rFonts w:eastAsiaTheme="majorEastAsia" w:cstheme="majorBidi"/>
@@ -4870,7 +4906,6 @@
   <w:style w:type="paragraph" w:customStyle="1" w:styleId="47">
     <w:name w:val="Captioned Figure"/>
     <w:basedOn w:val="46"/>
-    <w:qFormat/>
     <w:uiPriority w:val="0"/>
     <w:pPr>
       <w:keepNext/>
@@ -4880,7 +4915,6 @@
     <w:name w:val="Verbatim Char"/>
     <w:basedOn w:val="21"/>
     <w:link w:val="49"/>
-    <w:qFormat/>
     <w:uiPriority w:val="0"/>
     <w:rPr>
       <w:rFonts w:ascii="Consolas" w:hAnsi="Consolas"/>
@@ -4891,7 +4925,6 @@
     <w:name w:val="Source Code"/>
     <w:basedOn w:val="1"/>
     <w:link w:val="48"/>
-    <w:qFormat/>
     <w:uiPriority w:val="0"/>
     <w:pPr>
       <w:wordWrap w:val="0"/>
@@ -4921,7 +4954,6 @@
   <w:style w:type="character" w:customStyle="1" w:styleId="52">
     <w:name w:val="KeywordTok"/>
     <w:basedOn w:val="48"/>
-    <w:qFormat/>
     <w:uiPriority w:val="0"/>
     <w:rPr>
       <w:b/>
@@ -4931,7 +4963,6 @@
   <w:style w:type="character" w:customStyle="1" w:styleId="53">
     <w:name w:val="DataTypeTok"/>
     <w:basedOn w:val="48"/>
-    <w:qFormat/>
     <w:uiPriority w:val="0"/>
     <w:rPr>
       <w:color w:val="902000"/>
@@ -4948,7 +4979,6 @@
   <w:style w:type="character" w:customStyle="1" w:styleId="55">
     <w:name w:val="BaseNTok"/>
     <w:basedOn w:val="48"/>
-    <w:qFormat/>
     <w:uiPriority w:val="0"/>
     <w:rPr>
       <w:color w:val="40A070"/>
@@ -4957,7 +4987,6 @@
   <w:style w:type="character" w:customStyle="1" w:styleId="56">
     <w:name w:val="FloatTok"/>
     <w:basedOn w:val="48"/>
-    <w:qFormat/>
     <w:uiPriority w:val="0"/>
     <w:rPr>
       <w:color w:val="40A070"/>
@@ -4966,7 +4995,6 @@
   <w:style w:type="character" w:customStyle="1" w:styleId="57">
     <w:name w:val="ConstantTok"/>
     <w:basedOn w:val="48"/>
-    <w:qFormat/>
     <w:uiPriority w:val="0"/>
     <w:rPr>
       <w:color w:val="880000"/>
@@ -4975,7 +5003,6 @@
   <w:style w:type="character" w:customStyle="1" w:styleId="58">
     <w:name w:val="CharTok"/>
     <w:basedOn w:val="48"/>
-    <w:qFormat/>
     <w:uiPriority w:val="0"/>
     <w:rPr>
       <w:color w:val="4070A0"/>
@@ -4992,7 +5019,6 @@
   <w:style w:type="character" w:customStyle="1" w:styleId="60">
     <w:name w:val="StringTok"/>
     <w:basedOn w:val="48"/>
-    <w:qFormat/>
     <w:uiPriority w:val="0"/>
     <w:rPr>
       <w:color w:val="4070A0"/>
@@ -5001,7 +5027,6 @@
   <w:style w:type="character" w:customStyle="1" w:styleId="61">
     <w:name w:val="VerbatimStringTok"/>
     <w:basedOn w:val="48"/>
-    <w:qFormat/>
     <w:uiPriority w:val="0"/>
     <w:rPr>
       <w:color w:val="4070A0"/>
@@ -5010,7 +5035,6 @@
   <w:style w:type="character" w:customStyle="1" w:styleId="62">
     <w:name w:val="SpecialStringTok"/>
     <w:basedOn w:val="48"/>
-    <w:qFormat/>
     <w:uiPriority w:val="0"/>
     <w:rPr>
       <w:color w:val="BB6688"/>
@@ -5019,7 +5043,6 @@
   <w:style w:type="character" w:customStyle="1" w:styleId="63">
     <w:name w:val="ImportTok"/>
     <w:basedOn w:val="48"/>
-    <w:qFormat/>
     <w:uiPriority w:val="0"/>
     <w:rPr>
       <w:b/>
@@ -5038,7 +5061,6 @@
   <w:style w:type="character" w:customStyle="1" w:styleId="65">
     <w:name w:val="DocumentationTok"/>
     <w:basedOn w:val="48"/>
-    <w:qFormat/>
     <w:uiPriority w:val="0"/>
     <w:rPr>
       <w:i/>
@@ -5048,7 +5070,6 @@
   <w:style w:type="character" w:customStyle="1" w:styleId="66">
     <w:name w:val="AnnotationTok"/>
     <w:basedOn w:val="48"/>
-    <w:qFormat/>
     <w:uiPriority w:val="0"/>
     <w:rPr>
       <w:b/>
@@ -5059,7 +5080,6 @@
   <w:style w:type="character" w:customStyle="1" w:styleId="67">
     <w:name w:val="CommentVarTok"/>
     <w:basedOn w:val="48"/>
-    <w:qFormat/>
     <w:uiPriority w:val="0"/>
     <w:rPr>
       <w:b/>
@@ -5070,7 +5090,6 @@
   <w:style w:type="character" w:customStyle="1" w:styleId="68">
     <w:name w:val="OtherTok"/>
     <w:basedOn w:val="48"/>
-    <w:qFormat/>
     <w:uiPriority w:val="0"/>
     <w:rPr>
       <w:color w:val="007020"/>
@@ -5079,7 +5098,6 @@
   <w:style w:type="character" w:customStyle="1" w:styleId="69">
     <w:name w:val="FunctionTok"/>
     <w:basedOn w:val="48"/>
-    <w:qFormat/>
     <w:uiPriority w:val="0"/>
     <w:rPr>
       <w:color w:val="06287E"/>
@@ -5088,7 +5106,6 @@
   <w:style w:type="character" w:customStyle="1" w:styleId="70">
     <w:name w:val="VariableTok"/>
     <w:basedOn w:val="48"/>
-    <w:qFormat/>
     <w:uiPriority w:val="0"/>
     <w:rPr>
       <w:color w:val="19177C"/>
@@ -5097,7 +5114,6 @@
   <w:style w:type="character" w:customStyle="1" w:styleId="71">
     <w:name w:val="ControlFlowTok"/>
     <w:basedOn w:val="48"/>
-    <w:qFormat/>
     <w:uiPriority w:val="0"/>
     <w:rPr>
       <w:b/>
@@ -5115,7 +5131,6 @@
   <w:style w:type="character" w:customStyle="1" w:styleId="73">
     <w:name w:val="BuiltInTok"/>
     <w:basedOn w:val="48"/>
-    <w:qFormat/>
     <w:uiPriority w:val="0"/>
     <w:rPr>
       <w:color w:val="008000"/>
@@ -5124,7 +5139,6 @@
   <w:style w:type="character" w:customStyle="1" w:styleId="74">
     <w:name w:val="ExtensionTok"/>
     <w:basedOn w:val="48"/>
-    <w:qFormat/>
     <w:uiPriority w:val="0"/>
   </w:style>
   <w:style w:type="character" w:customStyle="1" w:styleId="75">

</xml_diff>